<commit_message>
docs: alinear métricas con el modelo seleccionado (min_samples_leaf=2)
- README: F1-macro de prueba de Random Forest 0.952 (model_13clases),
  aclaración de que error_analysis y ablation_study usan min_samples_leaf=1
  (0.942) y de la diferencia con el notebook integrador.
- Informe Word, con control de cambios: F1 de prueba 0.952 en secciones 4,
  5 y conclusiones; nota en la sección 6 sobre la configuración usada en el
  análisis de errores y la ablación; Tabla 6 alineada con ablation_study;
  caída sin BASC-3 de -68.4 puntos; confianza media en errores 0.499; pie
  de la Figura 12 sobre su origen.
- Interfaz: "F1-macro 0,95 en validación cruzada y en un conjunto de prueba".

Co-Authored-By: Claude Opus 5.5 <noreply@anthropic.com>
Claude-Session: https://claude.ai/code/session_01Y4RiX9kYXYfdoqadCw2Mn5
</commit_message>
<xml_diff>
--- a/EDA-TDAH/Informe_TDAH-9.docx
+++ b/EDA-TDAH/Informe_TDAH-9.docx
@@ -741,7 +741,6 @@
                 <w:lang w:val="es-ES"/>
               </w:rPr>
             </w:pPr>
-            <w:proofErr w:type="spellStart"/>
             <w:r>
               <w:rPr>
                 <w:rFonts w:asciiTheme="minorHAnsi" w:hAnsiTheme="minorHAnsi"/>
@@ -749,216 +748,7 @@
                 <w:sz w:val="18"/>
                 <w:lang w:val="es-ES"/>
               </w:rPr>
-              <w:t>antecedentes_familiares</w:t>
-            </w:r>
-            <w:proofErr w:type="spellEnd"/>
-            <w:r>
-              <w:rPr>
-                <w:rFonts w:asciiTheme="minorHAnsi" w:hAnsiTheme="minorHAnsi"/>
-                <w:color w:val="000000"/>
-                <w:sz w:val="18"/>
-                <w:lang w:val="es-ES"/>
-              </w:rPr>
-              <w:t xml:space="preserve">, </w:t>
-            </w:r>
-            <w:proofErr w:type="spellStart"/>
-            <w:r>
-              <w:rPr>
-                <w:rFonts w:asciiTheme="minorHAnsi" w:hAnsiTheme="minorHAnsi"/>
-                <w:color w:val="000000"/>
-                <w:sz w:val="18"/>
-                <w:lang w:val="es-ES"/>
-              </w:rPr>
-              <w:t>antecedentes_obstetricos</w:t>
-            </w:r>
-            <w:proofErr w:type="spellEnd"/>
-            <w:r>
-              <w:rPr>
-                <w:rFonts w:asciiTheme="minorHAnsi" w:hAnsiTheme="minorHAnsi"/>
-                <w:color w:val="000000"/>
-                <w:sz w:val="18"/>
-                <w:lang w:val="es-ES"/>
-              </w:rPr>
-              <w:t xml:space="preserve">, </w:t>
-            </w:r>
-            <w:proofErr w:type="spellStart"/>
-            <w:r>
-              <w:rPr>
-                <w:rFonts w:asciiTheme="minorHAnsi" w:hAnsiTheme="minorHAnsi"/>
-                <w:color w:val="000000"/>
-                <w:sz w:val="18"/>
-                <w:lang w:val="es-ES"/>
-              </w:rPr>
-              <w:t>retrasos_desarrollo</w:t>
-            </w:r>
-            <w:proofErr w:type="spellEnd"/>
-          </w:p>
-        </w:tc>
-      </w:tr>
-      <w:tr>
-        <w:trPr>
-          <w:cnfStyle w:val="000000100000" w:firstRow="0" w:lastRow="0" w:firstColumn="0" w:lastColumn="0" w:oddVBand="0" w:evenVBand="0" w:oddHBand="1" w:evenHBand="0" w:firstRowFirstColumn="0" w:firstRowLastColumn="0" w:lastRowFirstColumn="0" w:lastRowLastColumn="0"/>
-          <w:jc w:val="center"/>
-        </w:trPr>
-        <w:tc>
-          <w:tcPr>
-            <w:cnfStyle w:val="001000000000" w:firstRow="0" w:lastRow="0" w:firstColumn="1" w:lastColumn="0" w:oddVBand="0" w:evenVBand="0" w:oddHBand="0" w:evenHBand="0" w:firstRowFirstColumn="0" w:firstRowLastColumn="0" w:lastRowFirstColumn="0" w:lastRowLastColumn="0"/>
-            <w:tcW w:w="3168" w:type="dxa"/>
-            <w:vAlign w:val="center"/>
-          </w:tcPr>
-          <w:p>
-            <w:pPr>
-              <w:spacing w:after="20"/>
-              <w:jc w:val="both"/>
-              <w:rPr>
-                <w:rFonts w:asciiTheme="minorHAnsi" w:hAnsiTheme="minorHAnsi"/>
-                <w:lang w:val="es-ES"/>
-              </w:rPr>
-            </w:pPr>
-            <w:r>
-              <w:rPr>
-                <w:rFonts w:asciiTheme="minorHAnsi" w:hAnsiTheme="minorHAnsi"/>
-                <w:color w:val="000000"/>
-                <w:sz w:val="18"/>
-                <w:lang w:val="es-ES"/>
-              </w:rPr>
-              <w:t>Índices TDAH (0-1)</w:t>
-            </w:r>
-          </w:p>
-        </w:tc>
-        <w:tc>
-          <w:tcPr>
-            <w:tcW w:w="6912" w:type="dxa"/>
-            <w:vAlign w:val="center"/>
-          </w:tcPr>
-          <w:p>
-            <w:pPr>
-              <w:spacing w:after="20"/>
-              <w:jc w:val="both"/>
-              <w:cnfStyle w:val="000000100000" w:firstRow="0" w:lastRow="0" w:firstColumn="0" w:lastColumn="0" w:oddVBand="0" w:evenVBand="0" w:oddHBand="1" w:evenHBand="0" w:firstRowFirstColumn="0" w:firstRowLastColumn="0" w:lastRowFirstColumn="0" w:lastRowLastColumn="0"/>
-              <w:rPr>
-                <w:rFonts w:asciiTheme="minorHAnsi" w:hAnsiTheme="minorHAnsi"/>
-                <w:lang w:val="es-ES"/>
-              </w:rPr>
-            </w:pPr>
-            <w:proofErr w:type="spellStart"/>
-            <w:r>
-              <w:rPr>
-                <w:rFonts w:asciiTheme="minorHAnsi" w:hAnsiTheme="minorHAnsi"/>
-                <w:color w:val="000000"/>
-                <w:sz w:val="18"/>
-                <w:lang w:val="es-ES"/>
-              </w:rPr>
-              <w:t>indice_tdah</w:t>
-            </w:r>
-            <w:proofErr w:type="spellEnd"/>
-            <w:r>
-              <w:rPr>
-                <w:rFonts w:asciiTheme="minorHAnsi" w:hAnsiTheme="minorHAnsi"/>
-                <w:color w:val="000000"/>
-                <w:sz w:val="18"/>
-                <w:lang w:val="es-ES"/>
-              </w:rPr>
-              <w:t xml:space="preserve">, </w:t>
-            </w:r>
-            <w:proofErr w:type="spellStart"/>
-            <w:r>
-              <w:rPr>
-                <w:rFonts w:asciiTheme="minorHAnsi" w:hAnsiTheme="minorHAnsi"/>
-                <w:color w:val="000000"/>
-                <w:sz w:val="18"/>
-                <w:lang w:val="es-ES"/>
-              </w:rPr>
-              <w:t>indice_inatencion</w:t>
-            </w:r>
-            <w:proofErr w:type="spellEnd"/>
-            <w:r>
-              <w:rPr>
-                <w:rFonts w:asciiTheme="minorHAnsi" w:hAnsiTheme="minorHAnsi"/>
-                <w:color w:val="000000"/>
-                <w:sz w:val="18"/>
-                <w:lang w:val="es-ES"/>
-              </w:rPr>
-              <w:t xml:space="preserve">, </w:t>
-            </w:r>
-            <w:proofErr w:type="spellStart"/>
-            <w:r>
-              <w:rPr>
-                <w:rFonts w:asciiTheme="minorHAnsi" w:hAnsiTheme="minorHAnsi"/>
-                <w:color w:val="000000"/>
-                <w:sz w:val="18"/>
-                <w:lang w:val="es-ES"/>
-              </w:rPr>
-              <w:t>indice_impuls_hiperac</w:t>
-            </w:r>
-            <w:proofErr w:type="spellEnd"/>
-          </w:p>
-        </w:tc>
-      </w:tr>
-      <w:tr>
-        <w:trPr>
-          <w:jc w:val="center"/>
-        </w:trPr>
-        <w:tc>
-          <w:tcPr>
-            <w:cnfStyle w:val="001000000000" w:firstRow="0" w:lastRow="0" w:firstColumn="1" w:lastColumn="0" w:oddVBand="0" w:evenVBand="0" w:oddHBand="0" w:evenHBand="0" w:firstRowFirstColumn="0" w:firstRowLastColumn="0" w:lastRowFirstColumn="0" w:lastRowLastColumn="0"/>
-            <w:tcW w:w="3168" w:type="dxa"/>
-            <w:vAlign w:val="center"/>
-          </w:tcPr>
-          <w:p>
-            <w:pPr>
-              <w:spacing w:after="20"/>
-              <w:jc w:val="both"/>
-              <w:rPr>
-                <w:rFonts w:asciiTheme="minorHAnsi" w:hAnsiTheme="minorHAnsi"/>
-                <w:lang w:val="es-ES"/>
-              </w:rPr>
-            </w:pPr>
-            <w:r>
-              <w:rPr>
-                <w:rFonts w:asciiTheme="minorHAnsi" w:hAnsiTheme="minorHAnsi"/>
-                <w:color w:val="000000"/>
-                <w:sz w:val="18"/>
-                <w:lang w:val="es-ES"/>
-              </w:rPr>
-              <w:t>Cognitivo</w:t>
-            </w:r>
-          </w:p>
-        </w:tc>
-        <w:tc>
-          <w:tcPr>
-            <w:tcW w:w="6912" w:type="dxa"/>
-            <w:vAlign w:val="center"/>
-          </w:tcPr>
-          <w:p>
-            <w:pPr>
-              <w:spacing w:after="20"/>
-              <w:jc w:val="both"/>
-              <w:cnfStyle w:val="000000000000" w:firstRow="0" w:lastRow="0" w:firstColumn="0" w:lastColumn="0" w:oddVBand="0" w:evenVBand="0" w:oddHBand="0" w:evenHBand="0" w:firstRowFirstColumn="0" w:firstRowLastColumn="0" w:lastRowFirstColumn="0" w:lastRowLastColumn="0"/>
-              <w:rPr>
-                <w:rFonts w:asciiTheme="minorHAnsi" w:hAnsiTheme="minorHAnsi"/>
-                <w:lang w:val="es-ES"/>
-              </w:rPr>
-            </w:pPr>
-            <w:proofErr w:type="spellStart"/>
-            <w:r>
-              <w:rPr>
-                <w:rFonts w:asciiTheme="minorHAnsi" w:hAnsiTheme="minorHAnsi"/>
-                <w:color w:val="000000"/>
-                <w:sz w:val="18"/>
-                <w:lang w:val="es-ES"/>
-              </w:rPr>
-              <w:t>cit</w:t>
-            </w:r>
-            <w:proofErr w:type="spellEnd"/>
-            <w:r>
-              <w:rPr>
-                <w:rFonts w:asciiTheme="minorHAnsi" w:hAnsiTheme="minorHAnsi"/>
-                <w:color w:val="000000"/>
-                <w:sz w:val="18"/>
-                <w:lang w:val="es-ES"/>
-              </w:rPr>
-              <w:t xml:space="preserve"> (Coeficiente Intelectual Total)</w:t>
+              <w:t xml:space="preserve">antecedentes_familiares, antecedentes_obstetricos, retrasos_desarrollo</w:t>
             </w:r>
           </w:p>
         </w:tc>
@@ -990,6 +780,121 @@
                 <w:sz w:val="18"/>
                 <w:lang w:val="es-ES"/>
               </w:rPr>
+              <w:t>Índices TDAH (0-1)</w:t>
+            </w:r>
+          </w:p>
+        </w:tc>
+        <w:tc>
+          <w:tcPr>
+            <w:tcW w:w="6912" w:type="dxa"/>
+            <w:vAlign w:val="center"/>
+          </w:tcPr>
+          <w:p>
+            <w:pPr>
+              <w:spacing w:after="20"/>
+              <w:jc w:val="both"/>
+              <w:cnfStyle w:val="000000100000" w:firstRow="0" w:lastRow="0" w:firstColumn="0" w:lastColumn="0" w:oddVBand="0" w:evenVBand="0" w:oddHBand="1" w:evenHBand="0" w:firstRowFirstColumn="0" w:firstRowLastColumn="0" w:lastRowFirstColumn="0" w:lastRowLastColumn="0"/>
+              <w:rPr>
+                <w:rFonts w:asciiTheme="minorHAnsi" w:hAnsiTheme="minorHAnsi"/>
+                <w:lang w:val="es-ES"/>
+              </w:rPr>
+            </w:pPr>
+            <w:r>
+              <w:rPr>
+                <w:rFonts w:asciiTheme="minorHAnsi" w:hAnsiTheme="minorHAnsi"/>
+                <w:color w:val="000000"/>
+                <w:sz w:val="18"/>
+                <w:lang w:val="es-ES"/>
+              </w:rPr>
+              <w:t xml:space="preserve">indice_tdah, indice_inatencion, indice_impuls_hiperac</w:t>
+            </w:r>
+          </w:p>
+        </w:tc>
+      </w:tr>
+      <w:tr>
+        <w:trPr>
+          <w:jc w:val="center"/>
+        </w:trPr>
+        <w:tc>
+          <w:tcPr>
+            <w:cnfStyle w:val="001000000000" w:firstRow="0" w:lastRow="0" w:firstColumn="1" w:lastColumn="0" w:oddVBand="0" w:evenVBand="0" w:oddHBand="0" w:evenHBand="0" w:firstRowFirstColumn="0" w:firstRowLastColumn="0" w:lastRowFirstColumn="0" w:lastRowLastColumn="0"/>
+            <w:tcW w:w="3168" w:type="dxa"/>
+            <w:vAlign w:val="center"/>
+          </w:tcPr>
+          <w:p>
+            <w:pPr>
+              <w:spacing w:after="20"/>
+              <w:jc w:val="both"/>
+              <w:rPr>
+                <w:rFonts w:asciiTheme="minorHAnsi" w:hAnsiTheme="minorHAnsi"/>
+                <w:lang w:val="es-ES"/>
+              </w:rPr>
+            </w:pPr>
+            <w:r>
+              <w:rPr>
+                <w:rFonts w:asciiTheme="minorHAnsi" w:hAnsiTheme="minorHAnsi"/>
+                <w:color w:val="000000"/>
+                <w:sz w:val="18"/>
+                <w:lang w:val="es-ES"/>
+              </w:rPr>
+              <w:t>Cognitivo</w:t>
+            </w:r>
+          </w:p>
+        </w:tc>
+        <w:tc>
+          <w:tcPr>
+            <w:tcW w:w="6912" w:type="dxa"/>
+            <w:vAlign w:val="center"/>
+          </w:tcPr>
+          <w:p>
+            <w:pPr>
+              <w:spacing w:after="20"/>
+              <w:jc w:val="both"/>
+              <w:cnfStyle w:val="000000000000" w:firstRow="0" w:lastRow="0" w:firstColumn="0" w:lastColumn="0" w:oddVBand="0" w:evenVBand="0" w:oddHBand="0" w:evenHBand="0" w:firstRowFirstColumn="0" w:firstRowLastColumn="0" w:lastRowFirstColumn="0" w:lastRowLastColumn="0"/>
+              <w:rPr>
+                <w:rFonts w:asciiTheme="minorHAnsi" w:hAnsiTheme="minorHAnsi"/>
+                <w:lang w:val="es-ES"/>
+              </w:rPr>
+            </w:pPr>
+            <w:r>
+              <w:rPr>
+                <w:rFonts w:asciiTheme="minorHAnsi" w:hAnsiTheme="minorHAnsi"/>
+                <w:color w:val="000000"/>
+                <w:sz w:val="18"/>
+                <w:lang w:val="es-ES"/>
+              </w:rPr>
+              <w:t xml:space="preserve">cit (Coeficiente Intelectual Total)</w:t>
+            </w:r>
+          </w:p>
+        </w:tc>
+      </w:tr>
+      <w:tr>
+        <w:trPr>
+          <w:cnfStyle w:val="000000100000" w:firstRow="0" w:lastRow="0" w:firstColumn="0" w:lastColumn="0" w:oddVBand="0" w:evenVBand="0" w:oddHBand="1" w:evenHBand="0" w:firstRowFirstColumn="0" w:firstRowLastColumn="0" w:lastRowFirstColumn="0" w:lastRowLastColumn="0"/>
+          <w:jc w:val="center"/>
+        </w:trPr>
+        <w:tc>
+          <w:tcPr>
+            <w:cnfStyle w:val="001000000000" w:firstRow="0" w:lastRow="0" w:firstColumn="1" w:lastColumn="0" w:oddVBand="0" w:evenVBand="0" w:oddHBand="0" w:evenHBand="0" w:firstRowFirstColumn="0" w:firstRowLastColumn="0" w:lastRowFirstColumn="0" w:lastRowLastColumn="0"/>
+            <w:tcW w:w="3168" w:type="dxa"/>
+            <w:vAlign w:val="center"/>
+          </w:tcPr>
+          <w:p>
+            <w:pPr>
+              <w:spacing w:after="20"/>
+              <w:jc w:val="both"/>
+              <w:rPr>
+                <w:rFonts w:asciiTheme="minorHAnsi" w:hAnsiTheme="minorHAnsi"/>
+                <w:lang w:val="es-ES"/>
+              </w:rPr>
+            </w:pPr>
+            <w:r>
+              <w:rPr>
+                <w:rFonts w:asciiTheme="minorHAnsi" w:hAnsiTheme="minorHAnsi"/>
+                <w:color w:val="000000"/>
+                <w:sz w:val="18"/>
+                <w:lang w:val="es-ES"/>
+              </w:rPr>
               <w:t>Conductuales - BASC-3 (T-scores)</w:t>
             </w:r>
           </w:p>
@@ -1066,7 +971,6 @@
                 <w:lang w:val="es-ES"/>
               </w:rPr>
             </w:pPr>
-            <w:proofErr w:type="spellStart"/>
             <w:r>
               <w:rPr>
                 <w:rFonts w:asciiTheme="minorHAnsi" w:hAnsiTheme="minorHAnsi"/>
@@ -1076,7 +980,6 @@
               </w:rPr>
               <w:t>fluidez_fonologica</w:t>
             </w:r>
-            <w:proofErr w:type="spellEnd"/>
           </w:p>
         </w:tc>
       </w:tr>
@@ -1337,55 +1240,7 @@
           <w:rFonts w:asciiTheme="minorHAnsi" w:hAnsiTheme="minorHAnsi"/>
           <w:lang w:val="es-ES"/>
         </w:rPr>
-        <w:t xml:space="preserve">Revisión de consistencia entre </w:t>
-      </w:r>
-      <w:proofErr w:type="spellStart"/>
-      <w:r>
-        <w:rPr>
-          <w:rFonts w:asciiTheme="minorHAnsi" w:hAnsiTheme="minorHAnsi"/>
-          <w:lang w:val="es-ES"/>
-        </w:rPr>
-        <w:t>indice_tdah</w:t>
-      </w:r>
-      <w:proofErr w:type="spellEnd"/>
-      <w:r>
-        <w:rPr>
-          <w:rFonts w:asciiTheme="minorHAnsi" w:hAnsiTheme="minorHAnsi"/>
-          <w:lang w:val="es-ES"/>
-        </w:rPr>
-        <w:t xml:space="preserve"> y el promedio esperado de </w:t>
-      </w:r>
-      <w:proofErr w:type="spellStart"/>
-      <w:r>
-        <w:rPr>
-          <w:rFonts w:asciiTheme="minorHAnsi" w:hAnsiTheme="minorHAnsi"/>
-          <w:lang w:val="es-ES"/>
-        </w:rPr>
-        <w:t>indice_inatencion</w:t>
-      </w:r>
-      <w:proofErr w:type="spellEnd"/>
-      <w:r>
-        <w:rPr>
-          <w:rFonts w:asciiTheme="minorHAnsi" w:hAnsiTheme="minorHAnsi"/>
-          <w:lang w:val="es-ES"/>
-        </w:rPr>
-        <w:t xml:space="preserve"> e </w:t>
-      </w:r>
-      <w:proofErr w:type="spellStart"/>
-      <w:r>
-        <w:rPr>
-          <w:rFonts w:asciiTheme="minorHAnsi" w:hAnsiTheme="minorHAnsi"/>
-          <w:lang w:val="es-ES"/>
-        </w:rPr>
-        <w:t>indice_impuls_hiperac</w:t>
-      </w:r>
-      <w:proofErr w:type="spellEnd"/>
-      <w:r>
-        <w:rPr>
-          <w:rFonts w:asciiTheme="minorHAnsi" w:hAnsiTheme="minorHAnsi"/>
-          <w:lang w:val="es-ES"/>
-        </w:rPr>
-        <w:t>.</w:t>
+        <w:t xml:space="preserve">Revisión de consistencia entre indice_tdah y el promedio esperado de indice_inatencion e indice_impuls_hiperac.</w:t>
       </w:r>
     </w:p>
     <w:p>
@@ -1508,18 +1363,8 @@
           <w:sz w:val="28"/>
           <w:lang w:val="es-ES"/>
         </w:rPr>
-        <w:t xml:space="preserve">2.1 Control de </w:t>
+        <w:t xml:space="preserve">2.1 Control de leakage</w:t>
       </w:r>
-      <w:proofErr w:type="spellStart"/>
-      <w:r>
-        <w:rPr>
-          <w:rFonts w:asciiTheme="minorHAnsi" w:hAnsiTheme="minorHAnsi"/>
-          <w:sz w:val="28"/>
-          <w:lang w:val="es-ES"/>
-        </w:rPr>
-        <w:t>leakage</w:t>
-      </w:r>
-      <w:proofErr w:type="spellEnd"/>
     </w:p>
     <w:p>
       <w:pPr>
@@ -1533,21 +1378,7 @@
         <w:rPr>
           <w:lang w:val="es-ES"/>
         </w:rPr>
-        <w:t xml:space="preserve">La figura presenta dos análisis utilizados para evaluar el riesgo de </w:t>
-      </w:r>
-      <w:proofErr w:type="spellStart"/>
-      <w:r>
-        <w:rPr>
-          <w:lang w:val="es-ES"/>
-        </w:rPr>
-        <w:t>leakage</w:t>
-      </w:r>
-      <w:proofErr w:type="spellEnd"/>
-      <w:r>
-        <w:rPr>
-          <w:lang w:val="es-ES"/>
-        </w:rPr>
-        <w:t xml:space="preserve"> en las variables predictoras. El Panel A muestra la información mutua entre cada variable y la etiqueta diagnóstica, mientras que el Panel B presenta el desempeño F1-macro obtenido al entrenar modelos individuales utilizando cada predictor por separado.</w:t>
+        <w:t xml:space="preserve">La figura presenta dos análisis utilizados para evaluar el riesgo de leakage en las variables predictoras. El Panel A muestra la información mutua entre cada variable y la etiqueta diagnóstica, mientras que el Panel B presenta el desempeño F1-macro obtenido al entrenar modelos individuales utilizando cada predictor por separado.</w:t>
       </w:r>
     </w:p>
     <w:p>
@@ -1605,15 +1436,7 @@
         <w:pStyle w:val="Descripcin"/>
       </w:pPr>
       <w:r>
-        <w:t xml:space="preserve">Figura 2. Panel A: información mutua entre cada variable y la etiqueta diagnóstica. Panel B: F1-macro individual </w:t>
-      </w:r>
-      <w:proofErr w:type="spellStart"/>
-      <w:r>
-        <w:t>por</w:t>
-      </w:r>
-      <w:proofErr w:type="spellEnd"/>
-      <w:r>
-        <w:t xml:space="preserve"> predictor.</w:t>
+        <w:t xml:space="preserve">Figura 2. Panel A: información mutua entre cada variable y la etiqueta diagnóstica. Panel B: F1-macro individual por predictor.</w:t>
       </w:r>
     </w:p>
     <w:p>
@@ -1629,25 +1452,8 @@
           <w:rFonts w:asciiTheme="minorHAnsi" w:hAnsiTheme="minorHAnsi"/>
           <w:lang w:val="es-ES"/>
         </w:rPr>
-        <w:t xml:space="preserve">Las variables visibles corresponden únicamente a los predictores conservados en el modelo principal. Ninguna alcanza el umbral operativo utilizado para señalar posibles </w:t>
+        <w:t xml:space="preserve">Las variables visibles corresponden únicamente a los predictores conservados en el modelo principal. Ninguna alcanza el umbral operativo utilizado para señalar posibles proxies fuertes del diagnóstico (F1-macro = 0.70). Este umbral se empleó como criterio metodológico de referencia y no como una prueba estadística formal. Dentro de las variables retenidas, las escalas BASC-3 presentan la mayor capacidad discriminante relativa, aunque su desempeño individual permanece claramente por debajo del nivel considerado compatible con riesgo de </w:t>
       </w:r>
-      <w:proofErr w:type="spellStart"/>
-      <w:r>
-        <w:rPr>
-          <w:rFonts w:asciiTheme="minorHAnsi" w:hAnsiTheme="minorHAnsi"/>
-          <w:lang w:val="es-ES"/>
-        </w:rPr>
-        <w:t>proxies</w:t>
-      </w:r>
-      <w:proofErr w:type="spellEnd"/>
-      <w:r>
-        <w:rPr>
-          <w:rFonts w:asciiTheme="minorHAnsi" w:hAnsiTheme="minorHAnsi"/>
-          <w:lang w:val="es-ES"/>
-        </w:rPr>
-        <w:t xml:space="preserve"> fuertes del diagnóstico (F1-macro = 0.70). Este umbral se empleó como criterio metodológico de referencia y no como una prueba estadística formal. Dentro de las variables retenidas, las escalas BASC-3 presentan la mayor capacidad discriminante relativa, aunque su desempeño individual permanece claramente por debajo del nivel considerado compatible con riesgo de </w:t>
-      </w:r>
-      <w:proofErr w:type="spellStart"/>
       <w:r>
         <w:rPr>
           <w:rStyle w:val="s1"/>
@@ -1658,7 +1464,6 @@
         </w:rPr>
         <w:t>leakage</w:t>
       </w:r>
-      <w:proofErr w:type="spellEnd"/>
       <w:r>
         <w:rPr>
           <w:rFonts w:asciiTheme="minorHAnsi" w:hAnsiTheme="minorHAnsi"/>
@@ -1680,47 +1485,9 @@
           <w:rFonts w:asciiTheme="minorHAnsi" w:hAnsiTheme="minorHAnsi"/>
           <w:lang w:val="es-ES"/>
         </w:rPr>
-        <w:t xml:space="preserve">Las escalas BASC-3 (hiperactividad, problemas de conducta y problemas de atención) presentaron valores de información mutua (MI) con la etiqueta superiores a los observados en varios predictores conservados e incluso comparables a algunos índices excluidos por </w:t>
-      </w:r>
-      <w:proofErr w:type="spellStart"/>
-      <w:r>
-        <w:rPr>
-          <w:rFonts w:asciiTheme="minorHAnsi" w:hAnsiTheme="minorHAnsi"/>
-          <w:lang w:val="es-ES"/>
-        </w:rPr>
-        <w:t>leakage</w:t>
-      </w:r>
-      <w:proofErr w:type="spellEnd"/>
-      <w:r>
-        <w:rPr>
-          <w:rFonts w:asciiTheme="minorHAnsi" w:hAnsiTheme="minorHAnsi"/>
-          <w:lang w:val="es-ES"/>
-        </w:rPr>
-        <w:t xml:space="preserve">. Esto indica que el BASC-3 constituye una fuente de información altamente alineada con el diagnóstico, aunque no funciona como una variable proxy directa. La distinción metodológica relevante es que su desempeño individual permanece limitado (F1-macro máximo ≈ </w:t>
-      </w:r>
-      <w:r>
-        <w:rPr>
-          <w:rFonts w:asciiTheme="minorHAnsi" w:hAnsiTheme="minorHAnsi"/>
-          <w:lang w:val="es-ES"/>
-        </w:rPr>
+        <w:t xml:space="preserve">Las escalas BASC-3 (hiperactividad, problemas de conducta y problemas de atención) presentaron valores de información mutua (MI) con la etiqueta superiores a los observados en varios predictores conservados e incluso comparables a algunos índices excluidos por leakage. Esto indica que el BASC-3 constituye una fuente de información altamente alineada con el diagnóstico, aunque no funciona como una variable proxy directa. La distinción metodológica relevante es que su desempeño individual permanece limitado (F1-macro máximo ≈ </w:t>
         <w:lastRenderedPageBreak/>
-        <w:t xml:space="preserve">0.31), claramente por debajo del umbral operativo de 0.70. En consecuencia, ninguna escala BASC-3 reproduce por sí sola el criterio diagnóstico. En este análisis, la información mutua se utilizó como señal inicial de alerta, mientras que el desempeño F1-macro individual constituyó el criterio principal para definir la exclusión por </w:t>
-      </w:r>
-      <w:proofErr w:type="spellStart"/>
-      <w:r>
-        <w:rPr>
-          <w:rFonts w:asciiTheme="minorHAnsi" w:hAnsiTheme="minorHAnsi"/>
-          <w:lang w:val="es-ES"/>
-        </w:rPr>
-        <w:t>leakage</w:t>
-      </w:r>
-      <w:proofErr w:type="spellEnd"/>
-      <w:r>
-        <w:rPr>
-          <w:rFonts w:asciiTheme="minorHAnsi" w:hAnsiTheme="minorHAnsi"/>
-          <w:lang w:val="es-ES"/>
-        </w:rPr>
-        <w:t>.</w:t>
+        <w:t xml:space="preserve">0.31), claramente por debajo del umbral operativo de 0.70. En consecuencia, ninguna escala BASC-3 reproduce por sí sola el criterio diagnóstico. En este análisis, la información mutua se utilizó como señal inicial de alerta, mientras que el desempeño F1-macro individual constituyó el criterio principal para definir la exclusión por leakage.</w:t>
       </w:r>
     </w:p>
     <w:p>
@@ -1738,7 +1505,6 @@
         </w:rPr>
         <w:t xml:space="preserve">De manera independiente, los índices </w:t>
       </w:r>
-      <w:proofErr w:type="spellStart"/>
       <w:r>
         <w:rPr>
           <w:rStyle w:val="CdigoHTML"/>
@@ -1747,7 +1513,6 @@
         </w:rPr>
         <w:t>indice_tdah</w:t>
       </w:r>
-      <w:proofErr w:type="spellEnd"/>
       <w:r>
         <w:rPr>
           <w:rFonts w:asciiTheme="minorHAnsi" w:hAnsiTheme="minorHAnsi"/>
@@ -1755,7 +1520,6 @@
         </w:rPr>
         <w:t xml:space="preserve">, </w:t>
       </w:r>
-      <w:proofErr w:type="spellStart"/>
       <w:r>
         <w:rPr>
           <w:rStyle w:val="CdigoHTML"/>
@@ -1764,7 +1528,6 @@
         </w:rPr>
         <w:t>indice_inatencion</w:t>
       </w:r>
-      <w:proofErr w:type="spellEnd"/>
       <w:r>
         <w:rPr>
           <w:rFonts w:asciiTheme="minorHAnsi" w:hAnsiTheme="minorHAnsi"/>
@@ -1772,7 +1535,6 @@
         </w:rPr>
         <w:t xml:space="preserve"> e </w:t>
       </w:r>
-      <w:proofErr w:type="spellStart"/>
       <w:r>
         <w:rPr>
           <w:rStyle w:val="CdigoHTML"/>
@@ -1781,7 +1543,6 @@
         </w:rPr>
         <w:t>indice_impuls_hiperac</w:t>
       </w:r>
-      <w:proofErr w:type="spellEnd"/>
       <w:r>
         <w:rPr>
           <w:rFonts w:asciiTheme="minorHAnsi" w:hAnsiTheme="minorHAnsi"/>
@@ -1789,7 +1550,6 @@
         </w:rPr>
         <w:t xml:space="preserve"> fueron evaluados durante la fase de control de </w:t>
       </w:r>
-      <w:proofErr w:type="spellStart"/>
       <w:r>
         <w:rPr>
           <w:rStyle w:val="s1"/>
@@ -1800,7 +1560,6 @@
         </w:rPr>
         <w:t>leakage</w:t>
       </w:r>
-      <w:proofErr w:type="spellEnd"/>
       <w:r>
         <w:rPr>
           <w:rFonts w:asciiTheme="minorHAnsi" w:hAnsiTheme="minorHAnsi"/>
@@ -1929,39 +1688,7 @@
           <w:iCs/>
           <w:lang w:val="es-ES"/>
         </w:rPr>
-        <w:t xml:space="preserve">La distribución por sexo muestra predominio masculino en la mayoría de </w:t>
-      </w:r>
-      <w:r>
-        <w:rPr>
-          <w:rFonts w:asciiTheme="minorHAnsi" w:hAnsiTheme="minorHAnsi"/>
-          <w:iCs/>
-          <w:lang w:val="es-ES"/>
-        </w:rPr>
-        <w:t>las categorías</w:t>
-      </w:r>
-      <w:r>
-        <w:rPr>
-          <w:rFonts w:asciiTheme="minorHAnsi" w:hAnsiTheme="minorHAnsi"/>
-          <w:iCs/>
-          <w:lang w:val="es-ES"/>
-        </w:rPr>
-        <w:t xml:space="preserve"> diagnósticas. La magnitud del predominio varía entre subtipos, lo que sugiere heterogeneidad clínica dentro de la muestra. Las categorías con bajo soporte deben interpretarse con </w:t>
-      </w:r>
-      <w:r>
-        <w:rPr>
-          <w:rFonts w:asciiTheme="minorHAnsi" w:hAnsiTheme="minorHAnsi"/>
-          <w:iCs/>
-          <w:lang w:val="es-ES"/>
-        </w:rPr>
-        <w:t>cuidado</w:t>
-      </w:r>
-      <w:r>
-        <w:rPr>
-          <w:rFonts w:asciiTheme="minorHAnsi" w:hAnsiTheme="minorHAnsi"/>
-          <w:iCs/>
-          <w:lang w:val="es-ES"/>
-        </w:rPr>
-        <w:t xml:space="preserve"> porque pequeñas variaciones absolutas pueden generar cambios proporcionales amplios.</w:t>
+        <w:t xml:space="preserve">La distribución por sexo muestra predominio masculino en la mayoría de las categorías diagnósticas. La magnitud del predominio varía entre subtipos, lo que sugiere heterogeneidad clínica dentro de la muestra. Las categorías con bajo soporte deben interpretarse con cuidado porque pequeñas variaciones absolutas pueden generar cambios proporcionales amplios.</w:t>
       </w:r>
     </w:p>
     <w:p>
@@ -2228,19 +1955,7 @@
         <w:rPr>
           <w:lang w:val="es-ES"/>
         </w:rPr>
-        <w:t xml:space="preserve">En la mayoría de </w:t>
-      </w:r>
-      <w:r>
-        <w:rPr>
-          <w:lang w:val="es-ES"/>
-        </w:rPr>
-        <w:t>los grupos</w:t>
-      </w:r>
-      <w:r>
-        <w:rPr>
-          <w:lang w:val="es-ES"/>
-        </w:rPr>
-        <w:t xml:space="preserve"> predomina la categoría “No hay”, aunque algunas categorías asociadas a TDAH con comorbilidades presentan proporciones relativamente mayores de antecedentes relacionados con embarazo, parto o ambos. El grupo de desarrollo típico concentra una de las proporciones más altas de ausencia de antecedentes obstétricos reportados, mientras que ciertas categorías con TEA o TEAZ muestran distribuciones más equilibradas entre tipos de antecedentes. El estadístico Chi² (88.66; p ≈ 2.47×10</w:t>
+        <w:t xml:space="preserve">En la mayoría de los grupos predomina la categoría “No hay”, aunque algunas categorías asociadas a TDAH con comorbilidades presentan proporciones relativamente mayores de antecedentes relacionados con embarazo, parto o ambos. El grupo de desarrollo típico concentra una de las proporciones más altas de ausencia de antecedentes obstétricos reportados, mientras que ciertas categorías con TEA o TEAZ muestran distribuciones más equilibradas entre tipos de antecedentes. El estadístico Chi² (88.66; p ≈ 2.47×10</w:t>
       </w:r>
       <w:r>
         <w:rPr>
@@ -2380,56 +2095,36 @@
         <w:rPr>
           <w:lang w:val="es-ES"/>
         </w:rPr>
-        <w:t xml:space="preserve">La Figura 8 compara el desempeño de regresión logística, Random Forest y </w:t>
+        <w:t xml:space="preserve">La Figura 8 compara el desempeño de regresión logística, Random Forest y XGBoost mediante F1-macro en validación cruzada y en el conjunto de prueba. Random Forest presentó el mejor desempeño global, con F1-macro promedio en validación cruzada de 0.953 y F1-macro en prueba de </w:t>
       </w:r>
-      <w:proofErr w:type="spellStart"/>
+      <w:del w:id="90001" w:author="Claude" w:date="2026-10-28T19:30:00Z">
+        <w:r>
+          <w:rPr>
+            <w:lang w:val="es-ES"/>
+          </w:rPr>
+          <w:delText xml:space="preserve">0.942</w:delText>
+        </w:r>
+      </w:del>
+      <w:ins w:id="90002" w:author="Claude" w:date="2026-10-28T19:30:00Z">
+        <w:r>
+          <w:rPr>
+            <w:lang w:val="es-ES"/>
+          </w:rPr>
+          <w:t xml:space="preserve">0.952</w:t>
+        </w:r>
+      </w:ins>
       <w:r>
         <w:rPr>
           <w:lang w:val="es-ES"/>
         </w:rPr>
-        <w:t>XGBoost</w:t>
-      </w:r>
-      <w:proofErr w:type="spellEnd"/>
-      <w:r>
-        <w:rPr>
-          <w:lang w:val="es-ES"/>
-        </w:rPr>
-        <w:t xml:space="preserve"> mediante F1-macro en validación cruzada y en el conjunto de prueba. Random Forest presentó el mejor desempeño global, con F1-macro promedio en validación cruzada de 0.953 y F1-macro en prueba de 0.942. </w:t>
-      </w:r>
-      <w:proofErr w:type="spellStart"/>
-      <w:r>
-        <w:rPr>
-          <w:lang w:val="es-ES"/>
-        </w:rPr>
-        <w:t>XGBoost</w:t>
-      </w:r>
-      <w:proofErr w:type="spellEnd"/>
-      <w:r>
-        <w:rPr>
-          <w:lang w:val="es-ES"/>
-        </w:rPr>
-        <w:t xml:space="preserve"> mostró un desempeño cercano, mientras que regresión logística tuvo resultados inferiores, aunque aún consistentes. La cercanía entre los valores de validación cruzada y prueba sugiere estabilidad interna del modelo. No se observa una diferencia </w:t>
+        <w:t xml:space="preserve">. XGBoost mostró un desempeño cercano, mientras que regresión logística tuvo resultados inferiores, aunque aún consistentes. La cercanía entre los valores de validación cruzada y prueba sugiere estabilidad interna del modelo. No se observa una diferencia </w:t>
       </w:r>
       <w:r>
         <w:rPr>
           <w:lang w:val="es-ES"/>
         </w:rPr>
         <w:lastRenderedPageBreak/>
-        <w:t xml:space="preserve">importante entre validación cruzada y prueba bajo esta partición. No obstante, estos resultados corresponden a validación interna y no deben interpretarse como evidencia de generalización externa. La diferencia entre </w:t>
-      </w:r>
-      <w:proofErr w:type="spellStart"/>
-      <w:r>
-        <w:rPr>
-          <w:lang w:val="es-ES"/>
-        </w:rPr>
-        <w:t>accuracy</w:t>
-      </w:r>
-      <w:proofErr w:type="spellEnd"/>
-      <w:r>
-        <w:rPr>
-          <w:lang w:val="es-ES"/>
-        </w:rPr>
-        <w:t xml:space="preserve"> y F1-macro refleja parcialmente el desbalance entre categorías diagnósticas.</w:t>
+        <w:t xml:space="preserve">importante entre validación cruzada y prueba bajo esta partición. No obstante, estos resultados corresponden a validación interna y no deben interpretarse como evidencia de generalización externa. La diferencia entre accuracy y F1-macro refleja parcialmente el desbalance entre categorías diagnósticas.</w:t>
       </w:r>
     </w:p>
     <w:p>
@@ -2595,19 +2290,8 @@
                 <w:sz w:val="18"/>
                 <w:lang w:val="es-ES"/>
               </w:rPr>
-              <w:t xml:space="preserve">Test </w:t>
+              <w:t xml:space="preserve">Test accuracy</w:t>
             </w:r>
-            <w:proofErr w:type="spellStart"/>
-            <w:r>
-              <w:rPr>
-                <w:rFonts w:asciiTheme="minorHAnsi" w:hAnsiTheme="minorHAnsi"/>
-                <w:color w:val="FFFFFF" w:themeColor="background1"/>
-                <w:sz w:val="18"/>
-                <w:lang w:val="es-ES"/>
-              </w:rPr>
-              <w:t>accuracy</w:t>
-            </w:r>
-            <w:proofErr w:type="spellEnd"/>
           </w:p>
         </w:tc>
       </w:tr>
@@ -2844,15 +2528,28 @@
                 <w:lang w:val="es-ES"/>
               </w:rPr>
             </w:pPr>
-            <w:r>
-              <w:rPr>
-                <w:rFonts w:asciiTheme="minorHAnsi" w:hAnsiTheme="minorHAnsi"/>
-                <w:color w:val="000000"/>
-                <w:sz w:val="18"/>
-                <w:lang w:val="es-ES"/>
-              </w:rPr>
-              <w:t>0.942</w:t>
-            </w:r>
+            <w:del w:id="90003" w:author="Claude" w:date="2026-10-28T19:30:00Z">
+              <w:r>
+                <w:rPr>
+                  <w:rFonts w:asciiTheme="minorHAnsi" w:hAnsiTheme="minorHAnsi"/>
+                  <w:color w:val="000000"/>
+                  <w:sz w:val="18"/>
+                  <w:lang w:val="es-ES"/>
+                </w:rPr>
+                <w:delText xml:space="preserve">0.942</w:delText>
+              </w:r>
+            </w:del>
+            <w:ins w:id="90004" w:author="Claude" w:date="2026-10-28T19:30:00Z">
+              <w:r>
+                <w:rPr>
+                  <w:rFonts w:asciiTheme="minorHAnsi" w:hAnsiTheme="minorHAnsi"/>
+                  <w:color w:val="000000"/>
+                  <w:sz w:val="18"/>
+                  <w:lang w:val="es-ES"/>
+                </w:rPr>
+                <w:t xml:space="preserve">0.952</w:t>
+              </w:r>
+            </w:ins>
           </w:p>
         </w:tc>
         <w:tc>
@@ -2902,7 +2599,6 @@
                 <w:lang w:val="es-ES"/>
               </w:rPr>
             </w:pPr>
-            <w:proofErr w:type="spellStart"/>
             <w:r>
               <w:rPr>
                 <w:rFonts w:asciiTheme="minorHAnsi" w:hAnsiTheme="minorHAnsi"/>
@@ -2912,7 +2608,6 @@
               </w:rPr>
               <w:t>XGBoost</w:t>
             </w:r>
-            <w:proofErr w:type="spellEnd"/>
           </w:p>
         </w:tc>
         <w:tc>
@@ -3111,71 +2806,32 @@
           <w:rFonts w:asciiTheme="minorHAnsi" w:hAnsiTheme="minorHAnsi"/>
           <w:lang w:val="es-ES"/>
         </w:rPr>
-        <w:t xml:space="preserve">Random Forest presentó el mejor rendimiento interno. En prueba obtuvo F1-macro = 0.942, </w:t>
+        <w:t xml:space="preserve">Random Forest presentó el mejor rendimiento interno. En prueba obtuvo F1-macro = </w:t>
       </w:r>
-      <w:proofErr w:type="spellStart"/>
+      <w:del w:id="90005" w:author="Claude" w:date="2026-10-28T19:30:00Z">
+        <w:r>
+          <w:rPr>
+            <w:rFonts w:asciiTheme="minorHAnsi" w:hAnsiTheme="minorHAnsi"/>
+            <w:lang w:val="es-ES"/>
+          </w:rPr>
+          <w:delText xml:space="preserve">0.942</w:delText>
+        </w:r>
+      </w:del>
+      <w:ins w:id="90006" w:author="Claude" w:date="2026-10-28T19:30:00Z">
+        <w:r>
+          <w:rPr>
+            <w:rFonts w:asciiTheme="minorHAnsi" w:hAnsiTheme="minorHAnsi"/>
+            <w:lang w:val="es-ES"/>
+          </w:rPr>
+          <w:t xml:space="preserve">0.952</w:t>
+        </w:r>
+      </w:ins>
       <w:r>
         <w:rPr>
           <w:rFonts w:asciiTheme="minorHAnsi" w:hAnsiTheme="minorHAnsi"/>
           <w:lang w:val="es-ES"/>
         </w:rPr>
-        <w:t>accuracy</w:t>
-      </w:r>
-      <w:proofErr w:type="spellEnd"/>
-      <w:r>
-        <w:rPr>
-          <w:rFonts w:asciiTheme="minorHAnsi" w:hAnsiTheme="minorHAnsi"/>
-          <w:lang w:val="es-ES"/>
-        </w:rPr>
-        <w:t xml:space="preserve"> = 0.954, AUC macro </w:t>
-      </w:r>
-      <w:proofErr w:type="spellStart"/>
-      <w:r>
-        <w:rPr>
-          <w:rFonts w:asciiTheme="minorHAnsi" w:hAnsiTheme="minorHAnsi"/>
-          <w:lang w:val="es-ES"/>
-        </w:rPr>
-        <w:t>OvR</w:t>
-      </w:r>
-      <w:proofErr w:type="spellEnd"/>
-      <w:r>
-        <w:rPr>
-          <w:rFonts w:asciiTheme="minorHAnsi" w:hAnsiTheme="minorHAnsi"/>
-          <w:lang w:val="es-ES"/>
-        </w:rPr>
-        <w:t xml:space="preserve"> = 0.998 y AUC micro </w:t>
-      </w:r>
-      <w:proofErr w:type="spellStart"/>
-      <w:r>
-        <w:rPr>
-          <w:rFonts w:asciiTheme="minorHAnsi" w:hAnsiTheme="minorHAnsi"/>
-          <w:lang w:val="es-ES"/>
-        </w:rPr>
-        <w:t>OvR</w:t>
-      </w:r>
-      <w:proofErr w:type="spellEnd"/>
-      <w:r>
-        <w:rPr>
-          <w:rFonts w:asciiTheme="minorHAnsi" w:hAnsiTheme="minorHAnsi"/>
-          <w:lang w:val="es-ES"/>
-        </w:rPr>
-        <w:t xml:space="preserve"> = 0.998. La matriz de confusión muestra desempeño estable en la mayoría de </w:t>
-      </w:r>
-      <w:proofErr w:type="gramStart"/>
-      <w:r>
-        <w:rPr>
-          <w:rFonts w:asciiTheme="minorHAnsi" w:hAnsiTheme="minorHAnsi"/>
-          <w:lang w:val="es-ES"/>
-        </w:rPr>
-        <w:t>clases</w:t>
-      </w:r>
-      <w:proofErr w:type="gramEnd"/>
-      <w:r>
-        <w:rPr>
-          <w:rFonts w:asciiTheme="minorHAnsi" w:hAnsiTheme="minorHAnsi"/>
-          <w:lang w:val="es-ES"/>
-        </w:rPr>
-        <w:t>, aunque persisten errores en subtipos con perfiles cercanos o menor soporte.</w:t>
+        <w:t xml:space="preserve">, accuracy = 0.954, AUC macro OvR = 0.998 y AUC micro OvR = 0.998. La matriz de confusión muestra desempeño estable en la mayoría de clases, aunque persisten errores en subtipos con perfiles cercanos o menor soporte.</w:t>
       </w:r>
     </w:p>
     <w:p>
@@ -3261,25 +2917,7 @@
           <w:sz w:val="22"/>
           <w:lang w:val="es-ES"/>
         </w:rPr>
-        <w:t xml:space="preserve">La matriz de confusión muestra que la mayoría de </w:t>
-      </w:r>
-      <w:proofErr w:type="gramStart"/>
-      <w:r>
-        <w:rPr>
-          <w:rFonts w:asciiTheme="minorHAnsi" w:hAnsiTheme="minorHAnsi"/>
-          <w:sz w:val="22"/>
-          <w:lang w:val="es-ES"/>
-        </w:rPr>
-        <w:t>predicciones</w:t>
-      </w:r>
-      <w:proofErr w:type="gramEnd"/>
-      <w:r>
-        <w:rPr>
-          <w:rFonts w:asciiTheme="minorHAnsi" w:hAnsiTheme="minorHAnsi"/>
-          <w:sz w:val="22"/>
-          <w:lang w:val="es-ES"/>
-        </w:rPr>
-        <w:t xml:space="preserve"> se concentran sobre la diagonal principal, lo que indica clasificación correcta en gran parte de los casos. Los errores se concentran principalmente entre subtipos con perfiles sintomáticos cercanos o con menor número de ejemplos. Esto sugiere que el modelo discrimina adecuadamente las categorías principales, aunque presenta mayor incertidumbre en clases parcialmente solapadas.</w:t>
+        <w:t xml:space="preserve">La matriz de confusión muestra que la mayoría de predicciones se concentran sobre la diagonal principal, lo que indica clasificación correcta en gran parte de los casos. Los errores se concentran principalmente entre subtipos con perfiles sintomáticos cercanos o con menor número de ejemplos. Esto sugiere que el modelo discrimina adecuadamente las categorías principales, aunque presenta mayor incertidumbre en clases parcialmente solapadas.</w:t>
       </w:r>
     </w:p>
     <w:p>
@@ -3348,21 +2986,7 @@
         <w:rPr>
           <w:lang w:val="es-ES"/>
         </w:rPr>
-        <w:t xml:space="preserve">Figura 10. Curvas ROC multiclase </w:t>
-      </w:r>
-      <w:proofErr w:type="spellStart"/>
-      <w:r>
-        <w:rPr>
-          <w:lang w:val="es-ES"/>
-        </w:rPr>
-        <w:t>OvR</w:t>
-      </w:r>
-      <w:proofErr w:type="spellEnd"/>
-      <w:r>
-        <w:rPr>
-          <w:lang w:val="es-ES"/>
-        </w:rPr>
-        <w:t xml:space="preserve"> para el modelo Random Forest.</w:t>
+        <w:t xml:space="preserve">Figura 10. Curvas ROC multiclase OvR para el modelo Random Forest.</w:t>
       </w:r>
     </w:p>
     <w:p>
@@ -3379,43 +3003,7 @@
           <w:sz w:val="22"/>
           <w:lang w:val="es-ES"/>
         </w:rPr>
-        <w:t>Las curvas ROC muestran alta capacidad de separación entre clases bajo el esquema one-vs-</w:t>
-      </w:r>
-      <w:proofErr w:type="spellStart"/>
-      <w:r>
-        <w:rPr>
-          <w:rFonts w:asciiTheme="minorHAnsi" w:hAnsiTheme="minorHAnsi"/>
-          <w:sz w:val="22"/>
-          <w:lang w:val="es-ES"/>
-        </w:rPr>
-        <w:t>rest</w:t>
-      </w:r>
-      <w:proofErr w:type="spellEnd"/>
-      <w:r>
-        <w:rPr>
-          <w:rFonts w:asciiTheme="minorHAnsi" w:hAnsiTheme="minorHAnsi"/>
-          <w:sz w:val="22"/>
-          <w:lang w:val="es-ES"/>
-        </w:rPr>
-        <w:t xml:space="preserve">. Los valores AUC cercanos a 1 indican que el modelo distingue correctamente la mayoría de </w:t>
-      </w:r>
-      <w:proofErr w:type="gramStart"/>
-      <w:r>
-        <w:rPr>
-          <w:rFonts w:asciiTheme="minorHAnsi" w:hAnsiTheme="minorHAnsi"/>
-          <w:sz w:val="22"/>
-          <w:lang w:val="es-ES"/>
-        </w:rPr>
-        <w:t>categorías</w:t>
-      </w:r>
-      <w:proofErr w:type="gramEnd"/>
-      <w:r>
-        <w:rPr>
-          <w:rFonts w:asciiTheme="minorHAnsi" w:hAnsiTheme="minorHAnsi"/>
-          <w:sz w:val="22"/>
-          <w:lang w:val="es-ES"/>
-        </w:rPr>
-        <w:t xml:space="preserve"> en términos probabilísticos. Sin embargo, un AUC elevado no implica ausencia de errores clínicamente relevantes, especialmente en clases minoritarias.</w:t>
+        <w:t xml:space="preserve">Las curvas ROC muestran alta capacidad de separación entre clases bajo el esquema one-vs-rest. Los valores AUC cercanos a 1 indican que el modelo distingue correctamente la mayoría de categorías en términos probabilísticos. Sin embargo, un AUC elevado no implica ausencia de errores clínicamente relevantes, especialmente en clases minoritarias.</w:t>
       </w:r>
     </w:p>
     <w:p>
@@ -4086,21 +3674,7 @@
           <w:rFonts w:asciiTheme="minorHAnsi" w:hAnsiTheme="minorHAnsi"/>
           <w:lang w:val="es-ES"/>
         </w:rPr>
-        <w:t>El análisis de proxy individual no identificó una variable única con F1-macro mayor o igual a 0.70 entre los predictores incluidos. Sin embargo, el bloque BASC-3 actúa como conjunto de alto poder discriminante. Esto no invalida el modelo</w:t>
-      </w:r>
-      <w:r>
-        <w:rPr>
-          <w:rFonts w:asciiTheme="minorHAnsi" w:hAnsiTheme="minorHAnsi"/>
-          <w:lang w:val="es-ES"/>
-        </w:rPr>
-        <w:t xml:space="preserve"> para </w:t>
-      </w:r>
-      <w:r>
-        <w:rPr>
-          <w:rFonts w:asciiTheme="minorHAnsi" w:hAnsiTheme="minorHAnsi"/>
-          <w:lang w:val="es-ES"/>
-        </w:rPr>
-        <w:t>apoyar o auditar decisiones con información clínica disponible, pero limita su interpretación como fuente de evidencia diagnóstica independiente.</w:t>
+        <w:t xml:space="preserve">El análisis de proxy individual no identificó una variable única con F1-macro mayor o igual a 0.70 entre los predictores incluidos. Sin embargo, el bloque BASC-3 actúa como conjunto de alto poder discriminante. Esto no invalida el modelo para apoyar o auditar decisiones con información clínica disponible, pero limita su interpretación como fuente de evidencia diagnóstica independiente.</w:t>
       </w:r>
     </w:p>
     <w:p>
@@ -4130,12 +3704,21 @@
           <w:lang w:val="es-ES"/>
         </w:rPr>
       </w:pPr>
+      <w:ins w:id="90007" w:author="Claude" w:date="2026-10-28T19:30:00Z">
+        <w:r>
+          <w:rPr>
+            <w:rFonts w:asciiTheme="minorHAnsi" w:hAnsiTheme="minorHAnsi"/>
+            <w:lang w:val="es-ES"/>
+          </w:rPr>
+          <w:t xml:space="preserve">Este análisis y el estudio de ablación (sección 7) se ejecutaron con un Random Forest con min_samples_leaf = 1 (valor por defecto), cuyo F1-macro en prueba es 0.942; el modelo seleccionado (min_samples_leaf = 2, Tabla 3) comete 8 errores sobre los mismos 175 casos. </w:t>
+        </w:r>
+      </w:ins>
       <w:r>
         <w:rPr>
           <w:rFonts w:asciiTheme="minorHAnsi" w:hAnsiTheme="minorHAnsi"/>
           <w:lang w:val="es-ES"/>
         </w:rPr>
-        <w:t>En el conjunto de prueba se observaron 10 errores de clasificación sobre 175 casos, equivalentes al 5.7 %. Las clases con F1 inferior a 0.90 fueron TDAH combinado, TDAH hiperactivo/impulsivo y TDAH inatento + TND.</w:t>
+        <w:t xml:space="preserve">En el conjunto de prueba se observaron 10 errores de clasificación sobre 175 casos, equivalentes al 5.7 %. Las clases con F1 inferior a 0.90 fueron TDAH combinado, TDAH hiperactivo/impulsivo y TDAH inatento + TND.</w:t>
       </w:r>
     </w:p>
     <w:p>
@@ -4238,7 +3821,6 @@
                 <w:lang w:val="es-ES"/>
               </w:rPr>
             </w:pPr>
-            <w:proofErr w:type="spellStart"/>
             <w:r>
               <w:rPr>
                 <w:rFonts w:asciiTheme="minorHAnsi" w:hAnsiTheme="minorHAnsi"/>
@@ -4248,7 +3830,6 @@
               </w:rPr>
               <w:t>Recall</w:t>
             </w:r>
-            <w:proofErr w:type="spellEnd"/>
           </w:p>
         </w:tc>
         <w:tc>
@@ -4802,7 +4383,32 @@
           <w:rFonts w:asciiTheme="minorHAnsi" w:hAnsiTheme="minorHAnsi"/>
           <w:lang w:val="es-ES"/>
         </w:rPr>
-        <w:t>Confianza media en errores: 0.490.</w:t>
+        <w:t xml:space="preserve">Confianza media en errores: </w:t>
+      </w:r>
+      <w:del w:id="90032" w:author="Claude" w:date="2026-10-28T19:30:00Z">
+        <w:r>
+          <w:rPr>
+            <w:rFonts w:asciiTheme="minorHAnsi" w:hAnsiTheme="minorHAnsi"/>
+            <w:lang w:val="es-ES"/>
+          </w:rPr>
+          <w:delText xml:space="preserve">0.490</w:delText>
+        </w:r>
+      </w:del>
+      <w:ins w:id="90033" w:author="Claude" w:date="2026-10-28T19:30:00Z">
+        <w:r>
+          <w:rPr>
+            <w:rFonts w:asciiTheme="minorHAnsi" w:hAnsiTheme="minorHAnsi"/>
+            <w:lang w:val="es-ES"/>
+          </w:rPr>
+          <w:t xml:space="preserve">0.499</w:t>
+        </w:r>
+      </w:ins>
+      <w:r>
+        <w:rPr>
+          <w:rFonts w:asciiTheme="minorHAnsi" w:hAnsiTheme="minorHAnsi"/>
+          <w:lang w:val="es-ES"/>
+        </w:rPr>
+        <w:t xml:space="preserve">.</w:t>
       </w:r>
     </w:p>
     <w:p>
@@ -4871,8 +4477,16 @@
         <w:rPr>
           <w:lang w:val="es-ES"/>
         </w:rPr>
-        <w:t>Figura 12. Tipos de error y distribución de confianza en aciertos y errores.</w:t>
+        <w:t xml:space="preserve">Figura 12. Tipos de error y distribución de confianza en aciertos y errores.</w:t>
       </w:r>
+      <w:ins w:id="90034" w:author="Claude" w:date="2026-10-28T19:30:00Z">
+        <w:r>
+          <w:rPr>
+            <w:lang w:val="es-ES"/>
+          </w:rPr>
+          <w:t xml:space="preserve"> La figura proviene del notebook integrador (informe_tecnico_13clases), cuya ejecución registra 9 errores; por eso sus conteos difieren levemente del texto.</w:t>
+        </w:r>
+      </w:ins>
     </w:p>
     <w:p>
       <w:pPr>
@@ -4889,15 +4503,7 @@
           <w:iCs/>
           <w:lang w:val="es-ES"/>
         </w:rPr>
-        <w:t>Los errores se concentran en categorías clínicamente cercanas, particularmente entre subtipos TDAH y formas con comorbilidad.</w:t>
-      </w:r>
-      <w:r>
-        <w:rPr>
-          <w:rFonts w:asciiTheme="minorHAnsi" w:hAnsiTheme="minorHAnsi"/>
-          <w:iCs/>
-          <w:lang w:val="es-ES"/>
-        </w:rPr>
-        <w:t xml:space="preserve"> </w:t>
+        <w:t xml:space="preserve">Los errores se concentran en categorías clínicamente cercanas, particularmente entre subtipos TDAH y formas con comorbilidad. </w:t>
       </w:r>
       <w:r>
         <w:rPr>
@@ -4920,23 +4526,7 @@
           <w:rFonts w:asciiTheme="minorHAnsi" w:hAnsiTheme="minorHAnsi"/>
           <w:lang w:val="es-ES"/>
         </w:rPr>
-        <w:t xml:space="preserve">Los pares de confusión más frecuentes se concentran en la frontera entre los subtipos TDAH Combinado e Hiperactivo/Impulsivo. El único error intra-subtipo correspondió a un caso de TDAH </w:t>
-      </w:r>
-      <w:proofErr w:type="spellStart"/>
-      <w:r>
-        <w:rPr>
-          <w:rFonts w:asciiTheme="minorHAnsi" w:hAnsiTheme="minorHAnsi"/>
-          <w:lang w:val="es-ES"/>
-        </w:rPr>
-        <w:t>Inatento+TND</w:t>
-      </w:r>
-      <w:proofErr w:type="spellEnd"/>
-      <w:r>
-        <w:rPr>
-          <w:rFonts w:asciiTheme="minorHAnsi" w:hAnsiTheme="minorHAnsi"/>
-          <w:lang w:val="es-ES"/>
-        </w:rPr>
-        <w:t xml:space="preserve"> clasificado como TDAH Inatento, donde el componente conductual TND no fue suficientemente pronunciado para que el modelo lo detectara. El 90% de los errores son entre subtipos principales; la detección de comorbilidades (TND, TEAZ, TEA) es la parte más robusta.</w:t>
+        <w:t xml:space="preserve">Los pares de confusión más frecuentes se concentran en la frontera entre los subtipos TDAH Combinado e Hiperactivo/Impulsivo. El único error intra-subtipo correspondió a un caso de TDAH Inatento+TND clasificado como TDAH Inatento, donde el componente conductual TND no fue suficientemente pronunciado para que el modelo lo detectara. El 90% de los errores son entre subtipos principales; la detección de comorbilidades (TND, TEAZ, TEA) es la parte más robusta.</w:t>
       </w:r>
     </w:p>
     <w:p>
@@ -5062,19 +4652,8 @@
                 <w:sz w:val="18"/>
                 <w:lang w:val="es-ES"/>
               </w:rPr>
-              <w:t xml:space="preserve">N </w:t>
+              <w:t xml:space="preserve">N features</w:t>
             </w:r>
-            <w:proofErr w:type="spellStart"/>
-            <w:r>
-              <w:rPr>
-                <w:rFonts w:asciiTheme="minorHAnsi" w:hAnsiTheme="minorHAnsi"/>
-                <w:color w:val="FFFFFF" w:themeColor="background1"/>
-                <w:sz w:val="18"/>
-                <w:lang w:val="es-ES"/>
-              </w:rPr>
-              <w:t>features</w:t>
-            </w:r>
-            <w:proofErr w:type="spellEnd"/>
           </w:p>
         </w:tc>
         <w:tc>
@@ -5234,15 +4813,28 @@
                 <w:lang w:val="es-ES"/>
               </w:rPr>
             </w:pPr>
-            <w:r>
-              <w:rPr>
-                <w:rFonts w:asciiTheme="minorHAnsi" w:hAnsiTheme="minorHAnsi"/>
-                <w:color w:val="000000"/>
-                <w:sz w:val="18"/>
-                <w:lang w:val="es-ES"/>
-              </w:rPr>
-              <w:t>0.959</w:t>
-            </w:r>
+            <w:del w:id="90008" w:author="Claude" w:date="2026-10-28T19:30:00Z">
+              <w:r>
+                <w:rPr>
+                  <w:rFonts w:asciiTheme="minorHAnsi" w:hAnsiTheme="minorHAnsi"/>
+                  <w:color w:val="000000"/>
+                  <w:sz w:val="18"/>
+                  <w:lang w:val="es-ES"/>
+                </w:rPr>
+                <w:delText xml:space="preserve">0.959</w:delText>
+              </w:r>
+            </w:del>
+            <w:ins w:id="90009" w:author="Claude" w:date="2026-10-28T19:30:00Z">
+              <w:r>
+                <w:rPr>
+                  <w:rFonts w:asciiTheme="minorHAnsi" w:hAnsiTheme="minorHAnsi"/>
+                  <w:color w:val="000000"/>
+                  <w:sz w:val="18"/>
+                  <w:lang w:val="es-ES"/>
+                </w:rPr>
+                <w:t xml:space="preserve">0.954</w:t>
+              </w:r>
+            </w:ins>
           </w:p>
         </w:tc>
         <w:tc>
@@ -5260,15 +4852,28 @@
                 <w:lang w:val="es-ES"/>
               </w:rPr>
             </w:pPr>
-            <w:r>
-              <w:rPr>
-                <w:rFonts w:asciiTheme="minorHAnsi" w:hAnsiTheme="minorHAnsi"/>
-                <w:color w:val="000000"/>
-                <w:sz w:val="18"/>
-                <w:lang w:val="es-ES"/>
-              </w:rPr>
-              <w:t>0.014</w:t>
-            </w:r>
+            <w:del w:id="90010" w:author="Claude" w:date="2026-10-28T19:30:00Z">
+              <w:r>
+                <w:rPr>
+                  <w:rFonts w:asciiTheme="minorHAnsi" w:hAnsiTheme="minorHAnsi"/>
+                  <w:color w:val="000000"/>
+                  <w:sz w:val="18"/>
+                  <w:lang w:val="es-ES"/>
+                </w:rPr>
+                <w:delText xml:space="preserve">0.014</w:delText>
+              </w:r>
+            </w:del>
+            <w:ins w:id="90011" w:author="Claude" w:date="2026-10-28T19:30:00Z">
+              <w:r>
+                <w:rPr>
+                  <w:rFonts w:asciiTheme="minorHAnsi" w:hAnsiTheme="minorHAnsi"/>
+                  <w:color w:val="000000"/>
+                  <w:sz w:val="18"/>
+                  <w:lang w:val="es-ES"/>
+                </w:rPr>
+                <w:t xml:space="preserve">0.016</w:t>
+              </w:r>
+            </w:ins>
           </w:p>
         </w:tc>
         <w:tc>
@@ -5369,15 +4974,28 @@
                 <w:lang w:val="es-ES"/>
               </w:rPr>
             </w:pPr>
-            <w:r>
-              <w:rPr>
-                <w:rFonts w:asciiTheme="minorHAnsi" w:hAnsiTheme="minorHAnsi"/>
-                <w:color w:val="000000"/>
-                <w:sz w:val="18"/>
-                <w:lang w:val="es-ES"/>
-              </w:rPr>
-              <w:t>0.831</w:t>
-            </w:r>
+            <w:del w:id="90012" w:author="Claude" w:date="2026-10-28T19:30:00Z">
+              <w:r>
+                <w:rPr>
+                  <w:rFonts w:asciiTheme="minorHAnsi" w:hAnsiTheme="minorHAnsi"/>
+                  <w:color w:val="000000"/>
+                  <w:sz w:val="18"/>
+                  <w:lang w:val="es-ES"/>
+                </w:rPr>
+                <w:delText xml:space="preserve">0.831</w:delText>
+              </w:r>
+            </w:del>
+            <w:ins w:id="90013" w:author="Claude" w:date="2026-10-28T19:30:00Z">
+              <w:r>
+                <w:rPr>
+                  <w:rFonts w:asciiTheme="minorHAnsi" w:hAnsiTheme="minorHAnsi"/>
+                  <w:color w:val="000000"/>
+                  <w:sz w:val="18"/>
+                  <w:lang w:val="es-ES"/>
+                </w:rPr>
+                <w:t xml:space="preserve">0.833</w:t>
+              </w:r>
+            </w:ins>
           </w:p>
         </w:tc>
         <w:tc>
@@ -5395,15 +5013,28 @@
                 <w:lang w:val="es-ES"/>
               </w:rPr>
             </w:pPr>
-            <w:r>
-              <w:rPr>
-                <w:rFonts w:asciiTheme="minorHAnsi" w:hAnsiTheme="minorHAnsi"/>
-                <w:color w:val="000000"/>
-                <w:sz w:val="18"/>
-                <w:lang w:val="es-ES"/>
-              </w:rPr>
-              <w:t>0.047</w:t>
-            </w:r>
+            <w:del w:id="90014" w:author="Claude" w:date="2026-10-28T19:30:00Z">
+              <w:r>
+                <w:rPr>
+                  <w:rFonts w:asciiTheme="minorHAnsi" w:hAnsiTheme="minorHAnsi"/>
+                  <w:color w:val="000000"/>
+                  <w:sz w:val="18"/>
+                  <w:lang w:val="es-ES"/>
+                </w:rPr>
+                <w:delText xml:space="preserve">0.047</w:delText>
+              </w:r>
+            </w:del>
+            <w:ins w:id="90015" w:author="Claude" w:date="2026-10-28T19:30:00Z">
+              <w:r>
+                <w:rPr>
+                  <w:rFonts w:asciiTheme="minorHAnsi" w:hAnsiTheme="minorHAnsi"/>
+                  <w:color w:val="000000"/>
+                  <w:sz w:val="18"/>
+                  <w:lang w:val="es-ES"/>
+                </w:rPr>
+                <w:t xml:space="preserve">0.045</w:t>
+              </w:r>
+            </w:ins>
           </w:p>
         </w:tc>
         <w:tc>
@@ -5505,15 +5136,28 @@
                 <w:lang w:val="es-ES"/>
               </w:rPr>
             </w:pPr>
-            <w:r>
-              <w:rPr>
-                <w:rFonts w:asciiTheme="minorHAnsi" w:hAnsiTheme="minorHAnsi"/>
-                <w:color w:val="000000"/>
-                <w:sz w:val="18"/>
-                <w:lang w:val="es-ES"/>
-              </w:rPr>
-              <w:t>0.830</w:t>
-            </w:r>
+            <w:del w:id="90016" w:author="Claude" w:date="2026-10-28T19:30:00Z">
+              <w:r>
+                <w:rPr>
+                  <w:rFonts w:asciiTheme="minorHAnsi" w:hAnsiTheme="minorHAnsi"/>
+                  <w:color w:val="000000"/>
+                  <w:sz w:val="18"/>
+                  <w:lang w:val="es-ES"/>
+                </w:rPr>
+                <w:delText xml:space="preserve">0.830</w:delText>
+              </w:r>
+            </w:del>
+            <w:ins w:id="90017" w:author="Claude" w:date="2026-10-28T19:30:00Z">
+              <w:r>
+                <w:rPr>
+                  <w:rFonts w:asciiTheme="minorHAnsi" w:hAnsiTheme="minorHAnsi"/>
+                  <w:color w:val="000000"/>
+                  <w:sz w:val="18"/>
+                  <w:lang w:val="es-ES"/>
+                </w:rPr>
+                <w:t xml:space="preserve">0.829</w:t>
+              </w:r>
+            </w:ins>
           </w:p>
         </w:tc>
         <w:tc>
@@ -5640,15 +5284,28 @@
                 <w:lang w:val="es-ES"/>
               </w:rPr>
             </w:pPr>
-            <w:r>
-              <w:rPr>
-                <w:rFonts w:asciiTheme="minorHAnsi" w:hAnsiTheme="minorHAnsi"/>
-                <w:color w:val="000000"/>
-                <w:sz w:val="18"/>
-                <w:lang w:val="es-ES"/>
-              </w:rPr>
-              <w:t>0.245</w:t>
-            </w:r>
+            <w:del w:id="90018" w:author="Claude" w:date="2026-10-28T19:30:00Z">
+              <w:r>
+                <w:rPr>
+                  <w:rFonts w:asciiTheme="minorHAnsi" w:hAnsiTheme="minorHAnsi"/>
+                  <w:color w:val="000000"/>
+                  <w:sz w:val="18"/>
+                  <w:lang w:val="es-ES"/>
+                </w:rPr>
+                <w:delText xml:space="preserve">0.245</w:delText>
+              </w:r>
+            </w:del>
+            <w:ins w:id="90019" w:author="Claude" w:date="2026-10-28T19:30:00Z">
+              <w:r>
+                <w:rPr>
+                  <w:rFonts w:asciiTheme="minorHAnsi" w:hAnsiTheme="minorHAnsi"/>
+                  <w:color w:val="000000"/>
+                  <w:sz w:val="18"/>
+                  <w:lang w:val="es-ES"/>
+                </w:rPr>
+                <w:t xml:space="preserve">0.248</w:t>
+              </w:r>
+            </w:ins>
           </w:p>
         </w:tc>
         <w:tc>
@@ -5666,15 +5323,28 @@
                 <w:lang w:val="es-ES"/>
               </w:rPr>
             </w:pPr>
-            <w:r>
-              <w:rPr>
-                <w:rFonts w:asciiTheme="minorHAnsi" w:hAnsiTheme="minorHAnsi"/>
-                <w:color w:val="000000"/>
-                <w:sz w:val="18"/>
-                <w:lang w:val="es-ES"/>
-              </w:rPr>
-              <w:t>0.035</w:t>
-            </w:r>
+            <w:del w:id="90020" w:author="Claude" w:date="2026-10-28T19:30:00Z">
+              <w:r>
+                <w:rPr>
+                  <w:rFonts w:asciiTheme="minorHAnsi" w:hAnsiTheme="minorHAnsi"/>
+                  <w:color w:val="000000"/>
+                  <w:sz w:val="18"/>
+                  <w:lang w:val="es-ES"/>
+                </w:rPr>
+                <w:delText xml:space="preserve">0.035</w:delText>
+              </w:r>
+            </w:del>
+            <w:ins w:id="90021" w:author="Claude" w:date="2026-10-28T19:30:00Z">
+              <w:r>
+                <w:rPr>
+                  <w:rFonts w:asciiTheme="minorHAnsi" w:hAnsiTheme="minorHAnsi"/>
+                  <w:color w:val="000000"/>
+                  <w:sz w:val="18"/>
+                  <w:lang w:val="es-ES"/>
+                </w:rPr>
+                <w:t xml:space="preserve">0.039</w:t>
+              </w:r>
+            </w:ins>
           </w:p>
         </w:tc>
         <w:tc>
@@ -5692,15 +5362,28 @@
                 <w:lang w:val="es-ES"/>
               </w:rPr>
             </w:pPr>
-            <w:r>
-              <w:rPr>
-                <w:rFonts w:asciiTheme="minorHAnsi" w:hAnsiTheme="minorHAnsi"/>
-                <w:color w:val="000000"/>
-                <w:sz w:val="18"/>
-                <w:lang w:val="es-ES"/>
-              </w:rPr>
-              <w:t>0.268</w:t>
-            </w:r>
+            <w:del w:id="90022" w:author="Claude" w:date="2026-10-28T19:30:00Z">
+              <w:r>
+                <w:rPr>
+                  <w:rFonts w:asciiTheme="minorHAnsi" w:hAnsiTheme="minorHAnsi"/>
+                  <w:color w:val="000000"/>
+                  <w:sz w:val="18"/>
+                  <w:lang w:val="es-ES"/>
+                </w:rPr>
+                <w:delText xml:space="preserve">0.268</w:delText>
+              </w:r>
+            </w:del>
+            <w:ins w:id="90023" w:author="Claude" w:date="2026-10-28T19:30:00Z">
+              <w:r>
+                <w:rPr>
+                  <w:rFonts w:asciiTheme="minorHAnsi" w:hAnsiTheme="minorHAnsi"/>
+                  <w:color w:val="000000"/>
+                  <w:sz w:val="18"/>
+                  <w:lang w:val="es-ES"/>
+                </w:rPr>
+                <w:t xml:space="preserve">0.258</w:t>
+              </w:r>
+            </w:ins>
           </w:p>
         </w:tc>
       </w:tr>
@@ -5776,15 +5459,28 @@
                 <w:lang w:val="es-ES"/>
               </w:rPr>
             </w:pPr>
-            <w:r>
-              <w:rPr>
-                <w:rFonts w:asciiTheme="minorHAnsi" w:hAnsiTheme="minorHAnsi"/>
-                <w:color w:val="000000"/>
-                <w:sz w:val="18"/>
-                <w:lang w:val="es-ES"/>
-              </w:rPr>
-              <w:t>0.876</w:t>
-            </w:r>
+            <w:del w:id="90024" w:author="Claude" w:date="2026-10-28T19:30:00Z">
+              <w:r>
+                <w:rPr>
+                  <w:rFonts w:asciiTheme="minorHAnsi" w:hAnsiTheme="minorHAnsi"/>
+                  <w:color w:val="000000"/>
+                  <w:sz w:val="18"/>
+                  <w:lang w:val="es-ES"/>
+                </w:rPr>
+                <w:delText xml:space="preserve">0.876</w:delText>
+              </w:r>
+            </w:del>
+            <w:ins w:id="90025" w:author="Claude" w:date="2026-10-28T19:30:00Z">
+              <w:r>
+                <w:rPr>
+                  <w:rFonts w:asciiTheme="minorHAnsi" w:hAnsiTheme="minorHAnsi"/>
+                  <w:color w:val="000000"/>
+                  <w:sz w:val="18"/>
+                  <w:lang w:val="es-ES"/>
+                </w:rPr>
+                <w:t xml:space="preserve">0.874</w:t>
+              </w:r>
+            </w:ins>
           </w:p>
         </w:tc>
         <w:tc>
@@ -5802,15 +5498,28 @@
                 <w:lang w:val="es-ES"/>
               </w:rPr>
             </w:pPr>
-            <w:r>
-              <w:rPr>
-                <w:rFonts w:asciiTheme="minorHAnsi" w:hAnsiTheme="minorHAnsi"/>
-                <w:color w:val="000000"/>
-                <w:sz w:val="18"/>
-                <w:lang w:val="es-ES"/>
-              </w:rPr>
-              <w:t>0.025</w:t>
-            </w:r>
+            <w:del w:id="90026" w:author="Claude" w:date="2026-10-28T19:30:00Z">
+              <w:r>
+                <w:rPr>
+                  <w:rFonts w:asciiTheme="minorHAnsi" w:hAnsiTheme="minorHAnsi"/>
+                  <w:color w:val="000000"/>
+                  <w:sz w:val="18"/>
+                  <w:lang w:val="es-ES"/>
+                </w:rPr>
+                <w:delText xml:space="preserve">0.025</w:delText>
+              </w:r>
+            </w:del>
+            <w:ins w:id="90027" w:author="Claude" w:date="2026-10-28T19:30:00Z">
+              <w:r>
+                <w:rPr>
+                  <w:rFonts w:asciiTheme="minorHAnsi" w:hAnsiTheme="minorHAnsi"/>
+                  <w:color w:val="000000"/>
+                  <w:sz w:val="18"/>
+                  <w:lang w:val="es-ES"/>
+                </w:rPr>
+                <w:t xml:space="preserve">0.030</w:t>
+              </w:r>
+            </w:ins>
           </w:p>
         </w:tc>
         <w:tc>
@@ -5981,7 +5690,32 @@
           <w:rFonts w:asciiTheme="minorHAnsi" w:hAnsiTheme="minorHAnsi"/>
           <w:lang w:val="es-ES"/>
         </w:rPr>
-        <w:t>La eliminación completa del BASC-3 produce la caída más marcada: -67.4 puntos en F1-macro frente al modelo completo.</w:t>
+        <w:t xml:space="preserve">La eliminación completa del BASC-3 produce la caída más marcada: </w:t>
+      </w:r>
+      <w:del w:id="90028" w:author="Claude" w:date="2026-10-28T19:30:00Z">
+        <w:r>
+          <w:rPr>
+            <w:rFonts w:asciiTheme="minorHAnsi" w:hAnsiTheme="minorHAnsi"/>
+            <w:lang w:val="es-ES"/>
+          </w:rPr>
+          <w:delText xml:space="preserve">-67.4</w:delText>
+        </w:r>
+      </w:del>
+      <w:ins w:id="90029" w:author="Claude" w:date="2026-10-28T19:30:00Z">
+        <w:r>
+          <w:rPr>
+            <w:rFonts w:asciiTheme="minorHAnsi" w:hAnsiTheme="minorHAnsi"/>
+            <w:lang w:val="es-ES"/>
+          </w:rPr>
+          <w:t xml:space="preserve">-68.4</w:t>
+        </w:r>
+      </w:ins>
+      <w:r>
+        <w:rPr>
+          <w:rFonts w:asciiTheme="minorHAnsi" w:hAnsiTheme="minorHAnsi"/>
+          <w:lang w:val="es-ES"/>
+        </w:rPr>
+        <w:t xml:space="preserve"> puntos en F1-macro frente al modelo completo.</w:t>
       </w:r>
     </w:p>
     <w:p>
@@ -6105,23 +5839,7 @@
           <w:rFonts w:asciiTheme="minorHAnsi" w:hAnsiTheme="minorHAnsi"/>
           <w:lang w:val="es-ES"/>
         </w:rPr>
-        <w:t xml:space="preserve">Las escalas BASC-3, en especial problemas de atención e hiperactividad, fueron los predictores más informativos dentro del conjunto de variables conservadas tras el control de </w:t>
-      </w:r>
-      <w:proofErr w:type="spellStart"/>
-      <w:r>
-        <w:rPr>
-          <w:rFonts w:asciiTheme="minorHAnsi" w:hAnsiTheme="minorHAnsi"/>
-          <w:lang w:val="es-ES"/>
-        </w:rPr>
-        <w:t>leakage</w:t>
-      </w:r>
-      <w:proofErr w:type="spellEnd"/>
-      <w:r>
-        <w:rPr>
-          <w:rFonts w:asciiTheme="minorHAnsi" w:hAnsiTheme="minorHAnsi"/>
-          <w:lang w:val="es-ES"/>
-        </w:rPr>
-        <w:t>.</w:t>
+        <w:t xml:space="preserve">Las escalas BASC-3, en especial problemas de atención e hiperactividad, fueron los predictores más informativos dentro del conjunto de variables conservadas tras el control de leakage.</w:t>
       </w:r>
     </w:p>
     <w:p>
@@ -6139,7 +5857,32 @@
           <w:rFonts w:asciiTheme="minorHAnsi" w:hAnsiTheme="minorHAnsi"/>
           <w:lang w:val="es-ES"/>
         </w:rPr>
-        <w:t>Random Forest presentó el mejor desempeño entre los modelos evaluados, con F1-macro de 0.942 en el conjunto de prueba.</w:t>
+        <w:t xml:space="preserve">Random Forest presentó el mejor desempeño entre los modelos evaluados, con F1-macro de </w:t>
+      </w:r>
+      <w:del w:id="90030" w:author="Claude" w:date="2026-10-28T19:30:00Z">
+        <w:r>
+          <w:rPr>
+            <w:rFonts w:asciiTheme="minorHAnsi" w:hAnsiTheme="minorHAnsi"/>
+            <w:lang w:val="es-ES"/>
+          </w:rPr>
+          <w:delText xml:space="preserve">0.942</w:delText>
+        </w:r>
+      </w:del>
+      <w:ins w:id="90031" w:author="Claude" w:date="2026-10-28T19:30:00Z">
+        <w:r>
+          <w:rPr>
+            <w:rFonts w:asciiTheme="minorHAnsi" w:hAnsiTheme="minorHAnsi"/>
+            <w:lang w:val="es-ES"/>
+          </w:rPr>
+          <w:t xml:space="preserve">0.952</w:t>
+        </w:r>
+      </w:ins>
+      <w:r>
+        <w:rPr>
+          <w:rFonts w:asciiTheme="minorHAnsi" w:hAnsiTheme="minorHAnsi"/>
+          <w:lang w:val="es-ES"/>
+        </w:rPr>
+        <w:t xml:space="preserve"> en el conjunto de prueba.</w:t>
       </w:r>
     </w:p>
     <w:p>
@@ -6622,19 +6365,8 @@
                 <w:sz w:val="18"/>
                 <w:lang w:val="es-ES"/>
               </w:rPr>
-              <w:t xml:space="preserve">Variables excluidas por </w:t>
+              <w:t xml:space="preserve">Variables excluidas por leakage</w:t>
             </w:r>
-            <w:proofErr w:type="spellStart"/>
-            <w:r>
-              <w:rPr>
-                <w:rFonts w:asciiTheme="minorHAnsi" w:hAnsiTheme="minorHAnsi"/>
-                <w:color w:val="000000"/>
-                <w:sz w:val="18"/>
-                <w:lang w:val="es-ES"/>
-              </w:rPr>
-              <w:t>leakage</w:t>
-            </w:r>
-            <w:proofErr w:type="spellEnd"/>
           </w:p>
         </w:tc>
         <w:tc>
@@ -6685,27 +6417,7 @@
                 <w:sz w:val="18"/>
                 <w:lang w:val="es-ES"/>
               </w:rPr>
-              <w:t xml:space="preserve">Mantener dos escenarios: modelo sin </w:t>
-            </w:r>
-            <w:proofErr w:type="spellStart"/>
-            <w:r>
-              <w:rPr>
-                <w:rFonts w:asciiTheme="minorHAnsi" w:hAnsiTheme="minorHAnsi"/>
-                <w:color w:val="000000"/>
-                <w:sz w:val="18"/>
-                <w:lang w:val="es-ES"/>
-              </w:rPr>
-              <w:t>leakage</w:t>
-            </w:r>
-            <w:proofErr w:type="spellEnd"/>
-            <w:r>
-              <w:rPr>
-                <w:rFonts w:asciiTheme="minorHAnsi" w:hAnsiTheme="minorHAnsi"/>
-                <w:color w:val="000000"/>
-                <w:sz w:val="18"/>
-                <w:lang w:val="es-ES"/>
-              </w:rPr>
-              <w:t xml:space="preserve"> para evaluación metodológica y modelo clínico operacional claramente rotulado.</w:t>
+              <w:t xml:space="preserve">Mantener dos escenarios: modelo sin leakage para evaluación metodológica y modelo clínico operacional claramente rotulado.</w:t>
             </w:r>
           </w:p>
         </w:tc>

</xml_diff>

<commit_message>
docs: mejoras sobre informe final
</commit_message>
<xml_diff>
--- a/EDA-TDAH/Informe_TDAH-9.docx
+++ b/EDA-TDAH/Informe_TDAH-9.docx
@@ -1,6 +1,6 @@
 
 <file path=word/document.xml><?xml version="1.0" encoding="utf-8"?>
-<w:document xmlns:wpc="http://schemas.microsoft.com/office/word/2010/wordprocessingCanvas" xmlns:cx="http://schemas.microsoft.com/office/drawing/2014/chartex" xmlns:cx1="http://schemas.microsoft.com/office/drawing/2015/9/8/chartex" xmlns:cx2="http://schemas.microsoft.com/office/drawing/2015/10/21/chartex" xmlns:cx3="http://schemas.microsoft.com/office/drawing/2016/5/9/chartex" xmlns:cx4="http://schemas.microsoft.com/office/drawing/2016/5/10/chartex" xmlns:cx5="http://schemas.microsoft.com/office/drawing/2016/5/11/chartex" xmlns:cx6="http://schemas.microsoft.com/office/drawing/2016/5/12/chartex" xmlns:cx7="http://schemas.microsoft.com/office/drawing/2016/5/13/chartex" xmlns:cx8="http://schemas.microsoft.com/office/drawing/2016/5/14/chartex" xmlns:mc="http://schemas.openxmlformats.org/markup-compatibility/2006" xmlns:aink="http://schemas.microsoft.com/office/drawing/2016/ink" xmlns:am3d="http://schemas.microsoft.com/office/drawing/2017/model3d" xmlns:o="urn:schemas-microsoft-com:office:office" xmlns:oel="http://schemas.microsoft.com/office/2019/extlst" xmlns:r="http://schemas.openxmlformats.org/officeDocument/2006/relationships" xmlns:m="http://schemas.openxmlformats.org/officeDocument/2006/math" xmlns:v="urn:schemas-microsoft-com:vml" xmlns:wp14="http://schemas.microsoft.com/office/word/2010/wordprocessingDrawing" xmlns:wp="http://schemas.openxmlformats.org/drawingml/2006/wordprocessingDrawing" xmlns:w10="urn:schemas-microsoft-com:office:word" xmlns:w="http://schemas.openxmlformats.org/wordprocessingml/2006/main" xmlns:w14="http://schemas.microsoft.com/office/word/2010/wordml" xmlns:w15="http://schemas.microsoft.com/office/word/2012/wordml" xmlns:w16cex="http://schemas.microsoft.com/office/word/2018/wordml/cex" xmlns:w16cid="http://schemas.microsoft.com/office/word/2016/wordml/cid" xmlns:w16="http://schemas.microsoft.com/office/word/2018/wordml" xmlns:w16du="http://schemas.microsoft.com/office/word/2023/wordml/word16du" xmlns:w16sdtdh="http://schemas.microsoft.com/office/word/2020/wordml/sdtdatahash" xmlns:w16sdtfl="http://schemas.microsoft.com/office/word/2024/wordml/sdtformatlock" xmlns:w16se="http://schemas.microsoft.com/office/word/2015/wordml/symex" xmlns:wpg="http://schemas.microsoft.com/office/word/2010/wordprocessingGroup" xmlns:wpi="http://schemas.microsoft.com/office/word/2010/wordprocessingInk" xmlns:wne="http://schemas.microsoft.com/office/word/2006/wordml" xmlns:wps="http://schemas.microsoft.com/office/word/2010/wordprocessingShape" mc:Ignorable="w14 w15 w16se w16cid w16 w16cex w16sdtdh w16sdtfl w16du wp14">
+<w:document xmlns:wpc="http://schemas.microsoft.com/office/word/2010/wordprocessingCanvas" xmlns:cx="http://schemas.microsoft.com/office/drawing/2014/chartex" xmlns:cx1="http://schemas.microsoft.com/office/drawing/2015/9/8/chartex" xmlns:cx2="http://schemas.microsoft.com/office/drawing/2015/10/21/chartex" xmlns:cx3="http://schemas.microsoft.com/office/drawing/2016/5/9/chartex" xmlns:cx4="http://schemas.microsoft.com/office/drawing/2016/5/10/chartex" xmlns:cx5="http://schemas.microsoft.com/office/drawing/2016/5/11/chartex" xmlns:cx6="http://schemas.microsoft.com/office/drawing/2016/5/12/chartex" xmlns:cx7="http://schemas.microsoft.com/office/drawing/2016/5/13/chartex" xmlns:cx8="http://schemas.microsoft.com/office/drawing/2016/5/14/chartex" xmlns:mc="http://schemas.openxmlformats.org/markup-compatibility/2006" xmlns:m="http://schemas.openxmlformats.org/officeDocument/2006/math" xmlns:aink="http://schemas.microsoft.com/office/drawing/2016/ink" xmlns:am3d="http://schemas.microsoft.com/office/drawing/2017/model3d" xmlns:oel="http://schemas.microsoft.com/office/2019/extlst" xmlns:r="http://schemas.openxmlformats.org/officeDocument/2006/relationships" xmlns:wp14="http://schemas.microsoft.com/office/word/2010/wordprocessingDrawing" xmlns:wp="http://schemas.openxmlformats.org/drawingml/2006/wordprocessingDrawing" xmlns:wpg="http://schemas.microsoft.com/office/word/2010/wordprocessingGroup" xmlns:wpi="http://schemas.microsoft.com/office/word/2010/wordprocessingInk" xmlns:wps="http://schemas.microsoft.com/office/word/2010/wordprocessingShape" xmlns:o="urn:schemas-microsoft-com:office:office" xmlns:v="urn:schemas-microsoft-com:vml" xmlns:w10="urn:schemas-microsoft-com:office:word" xmlns:w="http://schemas.openxmlformats.org/wordprocessingml/2006/main" xmlns:w14="http://schemas.microsoft.com/office/word/2010/wordml" xmlns:w15="http://schemas.microsoft.com/office/word/2012/wordml" xmlns:w16cex="http://schemas.microsoft.com/office/word/2018/wordml/cex" xmlns:w16cid="http://schemas.microsoft.com/office/word/2016/wordml/cid" xmlns:w16="http://schemas.microsoft.com/office/word/2018/wordml" xmlns:w16sdtdh="http://schemas.microsoft.com/office/word/2020/wordml/sdtdatahash" xmlns:w16sdtfl="http://schemas.microsoft.com/office/word/2024/wordml/sdtformatlock" xmlns:w16se="http://schemas.microsoft.com/office/word/2015/wordml/symex" xmlns:w16du="http://schemas.microsoft.com/office/word/2023/wordml/word16du" xmlns:wne="http://schemas.microsoft.com/office/word/2006/wordml" mc:Ignorable="w14 w15 w16se w16cid w16 w16cex w16sdtdh w16sdtfl w16du wp14">
   <w:body>
     <w:p>
       <w:pPr>
@@ -748,7 +748,7 @@
                 <w:sz w:val="18"/>
                 <w:lang w:val="es-ES"/>
               </w:rPr>
-              <w:t xml:space="preserve">antecedentes_familiares, antecedentes_obstetricos, retrasos_desarrollo</w:t>
+              <w:t>antecedentes_familiares, antecedentes_obstetricos, retrasos_desarrollo</w:t>
             </w:r>
           </w:p>
         </w:tc>
@@ -806,7 +806,7 @@
                 <w:sz w:val="18"/>
                 <w:lang w:val="es-ES"/>
               </w:rPr>
-              <w:t xml:space="preserve">indice_tdah, indice_inatencion, indice_impuls_hiperac</w:t>
+              <w:t>indice_tdah, indice_inatencion, indice_impuls_hiperac</w:t>
             </w:r>
           </w:p>
         </w:tc>
@@ -863,7 +863,7 @@
                 <w:sz w:val="18"/>
                 <w:lang w:val="es-ES"/>
               </w:rPr>
-              <w:t xml:space="preserve">cit (Coeficiente Intelectual Total)</w:t>
+              <w:t>cit (Coeficiente Intelectual Total)</w:t>
             </w:r>
           </w:p>
         </w:tc>
@@ -1240,7 +1240,7 @@
           <w:rFonts w:asciiTheme="minorHAnsi" w:hAnsiTheme="minorHAnsi"/>
           <w:lang w:val="es-ES"/>
         </w:rPr>
-        <w:t xml:space="preserve">Revisión de consistencia entre indice_tdah y el promedio esperado de indice_inatencion e indice_impuls_hiperac.</w:t>
+        <w:t>Revisión de consistencia entre indice_tdah y el promedio esperado de indice_inatencion e indice_impuls_hiperac.</w:t>
       </w:r>
     </w:p>
     <w:p>
@@ -1363,7 +1363,7 @@
           <w:sz w:val="28"/>
           <w:lang w:val="es-ES"/>
         </w:rPr>
-        <w:t xml:space="preserve">2.1 Control de leakage</w:t>
+        <w:t>2.1 Control de leakage</w:t>
       </w:r>
     </w:p>
     <w:p>
@@ -1378,7 +1378,7 @@
         <w:rPr>
           <w:lang w:val="es-ES"/>
         </w:rPr>
-        <w:t xml:space="preserve">La figura presenta dos análisis utilizados para evaluar el riesgo de leakage en las variables predictoras. El Panel A muestra la información mutua entre cada variable y la etiqueta diagnóstica, mientras que el Panel B presenta el desempeño F1-macro obtenido al entrenar modelos individuales utilizando cada predictor por separado.</w:t>
+        <w:t>La figura presenta dos análisis utilizados para evaluar el riesgo de leakage en las variables predictoras. El Panel A muestra la información mutua entre cada variable y la etiqueta diagnóstica, mientras que el Panel B presenta el desempeño F1-macro obtenido al entrenar modelos individuales utilizando cada predictor por separado.</w:t>
       </w:r>
     </w:p>
     <w:p>
@@ -1436,7 +1436,7 @@
         <w:pStyle w:val="Descripcin"/>
       </w:pPr>
       <w:r>
-        <w:t xml:space="preserve">Figura 2. Panel A: información mutua entre cada variable y la etiqueta diagnóstica. Panel B: F1-macro individual por predictor.</w:t>
+        <w:t>Figura 2. Panel A: información mutua entre cada variable y la etiqueta diagnóstica. Panel B: F1-macro individual por predictor.</w:t>
       </w:r>
     </w:p>
     <w:p>
@@ -1486,8 +1486,14 @@
           <w:lang w:val="es-ES"/>
         </w:rPr>
         <w:t xml:space="preserve">Las escalas BASC-3 (hiperactividad, problemas de conducta y problemas de atención) presentaron valores de información mutua (MI) con la etiqueta superiores a los observados en varios predictores conservados e incluso comparables a algunos índices excluidos por leakage. Esto indica que el BASC-3 constituye una fuente de información altamente alineada con el diagnóstico, aunque no funciona como una variable proxy directa. La distinción metodológica relevante es que su desempeño individual permanece limitado (F1-macro máximo ≈ </w:t>
+      </w:r>
+      <w:r>
+        <w:rPr>
+          <w:rFonts w:asciiTheme="minorHAnsi" w:hAnsiTheme="minorHAnsi"/>
+          <w:lang w:val="es-ES"/>
+        </w:rPr>
         <w:lastRenderedPageBreak/>
-        <w:t xml:space="preserve">0.31), claramente por debajo del umbral operativo de 0.70. En consecuencia, ninguna escala BASC-3 reproduce por sí sola el criterio diagnóstico. En este análisis, la información mutua se utilizó como señal inicial de alerta, mientras que el desempeño F1-macro individual constituyó el criterio principal para definir la exclusión por leakage.</w:t>
+        <w:t>0.31), claramente por debajo del umbral operativo de 0.70. En consecuencia, ninguna escala BASC-3 reproduce por sí sola el criterio diagnóstico. En este análisis, la información mutua se utilizó como señal inicial de alerta, mientras que el desempeño F1-macro individual constituyó el criterio principal para definir la exclusión por leakage.</w:t>
       </w:r>
     </w:p>
     <w:p>
@@ -1688,7 +1694,7 @@
           <w:iCs/>
           <w:lang w:val="es-ES"/>
         </w:rPr>
-        <w:t xml:space="preserve">La distribución por sexo muestra predominio masculino en la mayoría de las categorías diagnósticas. La magnitud del predominio varía entre subtipos, lo que sugiere heterogeneidad clínica dentro de la muestra. Las categorías con bajo soporte deben interpretarse con cuidado porque pequeñas variaciones absolutas pueden generar cambios proporcionales amplios.</w:t>
+        <w:t>La distribución por sexo muestra predominio masculino en la mayoría de las categorías diagnósticas. La magnitud del predominio varía entre subtipos, lo que sugiere heterogeneidad clínica dentro de la muestra. Las categorías con bajo soporte deben interpretarse con cuidado porque pequeñas variaciones absolutas pueden generar cambios proporcionales amplios.</w:t>
       </w:r>
     </w:p>
     <w:p>
@@ -1955,7 +1961,7 @@
         <w:rPr>
           <w:lang w:val="es-ES"/>
         </w:rPr>
-        <w:t xml:space="preserve">En la mayoría de los grupos predomina la categoría “No hay”, aunque algunas categorías asociadas a TDAH con comorbilidades presentan proporciones relativamente mayores de antecedentes relacionados con embarazo, parto o ambos. El grupo de desarrollo típico concentra una de las proporciones más altas de ausencia de antecedentes obstétricos reportados, mientras que ciertas categorías con TEA o TEAZ muestran distribuciones más equilibradas entre tipos de antecedentes. El estadístico Chi² (88.66; p ≈ 2.47×10</w:t>
+        <w:t>En la mayoría de los grupos predomina la categoría “No hay”, aunque algunas categorías asociadas a TDAH con comorbilidades presentan proporciones relativamente mayores de antecedentes relacionados con embarazo, parto o ambos. El grupo de desarrollo típico concentra una de las proporciones más altas de ausencia de antecedentes obstétricos reportados, mientras que ciertas categorías con TEA o TEAZ muestran distribuciones más equilibradas entre tipos de antecedentes. El estadístico Chi² (88.66; p ≈ 2.47×10</w:t>
       </w:r>
       <w:r>
         <w:rPr>
@@ -2095,36 +2101,14 @@
         <w:rPr>
           <w:lang w:val="es-ES"/>
         </w:rPr>
-        <w:t xml:space="preserve">La Figura 8 compara el desempeño de regresión logística, Random Forest y XGBoost mediante F1-macro en validación cruzada y en el conjunto de prueba. Random Forest presentó el mejor desempeño global, con F1-macro promedio en validación cruzada de 0.953 y F1-macro en prueba de </w:t>
-      </w:r>
-      <w:del w:id="90001" w:author="Claude" w:date="2026-10-28T19:30:00Z">
-        <w:r>
-          <w:rPr>
-            <w:lang w:val="es-ES"/>
-          </w:rPr>
-          <w:delText xml:space="preserve">0.942</w:delText>
-        </w:r>
-      </w:del>
-      <w:ins w:id="90002" w:author="Claude" w:date="2026-10-28T19:30:00Z">
-        <w:r>
-          <w:rPr>
-            <w:lang w:val="es-ES"/>
-          </w:rPr>
-          <w:t xml:space="preserve">0.952</w:t>
-        </w:r>
-      </w:ins>
-      <w:r>
-        <w:rPr>
-          <w:lang w:val="es-ES"/>
-        </w:rPr>
-        <w:t xml:space="preserve">. XGBoost mostró un desempeño cercano, mientras que regresión logística tuvo resultados inferiores, aunque aún consistentes. La cercanía entre los valores de validación cruzada y prueba sugiere estabilidad interna del modelo. No se observa una diferencia </w:t>
+        <w:t xml:space="preserve">La Figura 8 compara el desempeño de regresión logística, Random Forest y XGBoost mediante F1-macro en validación cruzada y en el conjunto de prueba. Random Forest presentó el mejor desempeño global, con F1-macro promedio en validación cruzada de 0.953 y F1-macro en prueba de 0.952. XGBoost mostró un desempeño cercano, mientras que regresión logística tuvo resultados inferiores, aunque aún consistentes. La cercanía entre los valores de validación cruzada y prueba sugiere estabilidad interna del modelo. No se observa una diferencia </w:t>
       </w:r>
       <w:r>
         <w:rPr>
           <w:lang w:val="es-ES"/>
         </w:rPr>
         <w:lastRenderedPageBreak/>
-        <w:t xml:space="preserve">importante entre validación cruzada y prueba bajo esta partición. No obstante, estos resultados corresponden a validación interna y no deben interpretarse como evidencia de generalización externa. La diferencia entre accuracy y F1-macro refleja parcialmente el desbalance entre categorías diagnósticas.</w:t>
+        <w:t>importante entre validación cruzada y prueba bajo esta partición. No obstante, estos resultados corresponden a validación interna y no deben interpretarse como evidencia de generalización externa. La diferencia entre accuracy y F1-macro refleja parcialmente el desbalance entre categorías diagnósticas.</w:t>
       </w:r>
     </w:p>
     <w:p>
@@ -2290,7 +2274,7 @@
                 <w:sz w:val="18"/>
                 <w:lang w:val="es-ES"/>
               </w:rPr>
-              <w:t xml:space="preserve">Test accuracy</w:t>
+              <w:t>Test accuracy</w:t>
             </w:r>
           </w:p>
         </w:tc>
@@ -2528,28 +2512,15 @@
                 <w:lang w:val="es-ES"/>
               </w:rPr>
             </w:pPr>
-            <w:del w:id="90003" w:author="Claude" w:date="2026-10-28T19:30:00Z">
-              <w:r>
-                <w:rPr>
-                  <w:rFonts w:asciiTheme="minorHAnsi" w:hAnsiTheme="minorHAnsi"/>
-                  <w:color w:val="000000"/>
-                  <w:sz w:val="18"/>
-                  <w:lang w:val="es-ES"/>
-                </w:rPr>
-                <w:delText xml:space="preserve">0.942</w:delText>
-              </w:r>
-            </w:del>
-            <w:ins w:id="90004" w:author="Claude" w:date="2026-10-28T19:30:00Z">
-              <w:r>
-                <w:rPr>
-                  <w:rFonts w:asciiTheme="minorHAnsi" w:hAnsiTheme="minorHAnsi"/>
-                  <w:color w:val="000000"/>
-                  <w:sz w:val="18"/>
-                  <w:lang w:val="es-ES"/>
-                </w:rPr>
-                <w:t xml:space="preserve">0.952</w:t>
-              </w:r>
-            </w:ins>
+            <w:r>
+              <w:rPr>
+                <w:rFonts w:asciiTheme="minorHAnsi" w:hAnsiTheme="minorHAnsi"/>
+                <w:color w:val="000000"/>
+                <w:sz w:val="18"/>
+                <w:lang w:val="es-ES"/>
+              </w:rPr>
+              <w:t>0.952</w:t>
+            </w:r>
           </w:p>
         </w:tc>
         <w:tc>
@@ -2806,32 +2777,23 @@
           <w:rFonts w:asciiTheme="minorHAnsi" w:hAnsiTheme="minorHAnsi"/>
           <w:lang w:val="es-ES"/>
         </w:rPr>
-        <w:t xml:space="preserve">Random Forest presentó el mejor rendimiento interno. En prueba obtuvo F1-macro = </w:t>
+        <w:t xml:space="preserve">Random Forest presentó el mejor rendimiento interno. En prueba obtuvo F1-macro = 0.952, </w:t>
       </w:r>
-      <w:del w:id="90005" w:author="Claude" w:date="2026-10-28T19:30:00Z">
-        <w:r>
-          <w:rPr>
-            <w:rFonts w:asciiTheme="minorHAnsi" w:hAnsiTheme="minorHAnsi"/>
-            <w:lang w:val="es-ES"/>
-          </w:rPr>
-          <w:delText xml:space="preserve">0.942</w:delText>
-        </w:r>
-      </w:del>
-      <w:ins w:id="90006" w:author="Claude" w:date="2026-10-28T19:30:00Z">
-        <w:r>
-          <w:rPr>
-            <w:rFonts w:asciiTheme="minorHAnsi" w:hAnsiTheme="minorHAnsi"/>
-            <w:lang w:val="es-ES"/>
-          </w:rPr>
-          <w:t xml:space="preserve">0.952</w:t>
-        </w:r>
-      </w:ins>
+      <w:proofErr w:type="spellStart"/>
       <w:r>
         <w:rPr>
           <w:rFonts w:asciiTheme="minorHAnsi" w:hAnsiTheme="minorHAnsi"/>
           <w:lang w:val="es-ES"/>
         </w:rPr>
-        <w:t xml:space="preserve">, accuracy = 0.954, AUC macro OvR = 0.998 y AUC micro OvR = 0.998. La matriz de confusión muestra desempeño estable en la mayoría de clases, aunque persisten errores en subtipos con perfiles cercanos o menor soporte.</w:t>
+        <w:t>accuracy</w:t>
+      </w:r>
+      <w:proofErr w:type="spellEnd"/>
+      <w:r>
+        <w:rPr>
+          <w:rFonts w:asciiTheme="minorHAnsi" w:hAnsiTheme="minorHAnsi"/>
+          <w:lang w:val="es-ES"/>
+        </w:rPr>
+        <w:t xml:space="preserve"> = 0.954, AUC macro OvR = 0.998 y AUC micro OvR = 0.998. La matriz de confusión muestra desempeño estable en la mayoría de clases, aunque persisten errores en subtipos con perfiles cercanos o menor soporte.</w:t>
       </w:r>
     </w:p>
     <w:p>
@@ -2917,7 +2879,7 @@
           <w:sz w:val="22"/>
           <w:lang w:val="es-ES"/>
         </w:rPr>
-        <w:t xml:space="preserve">La matriz de confusión muestra que la mayoría de predicciones se concentran sobre la diagonal principal, lo que indica clasificación correcta en gran parte de los casos. Los errores se concentran principalmente entre subtipos con perfiles sintomáticos cercanos o con menor número de ejemplos. Esto sugiere que el modelo discrimina adecuadamente las categorías principales, aunque presenta mayor incertidumbre en clases parcialmente solapadas.</w:t>
+        <w:t>La matriz de confusión muestra que la mayoría de predicciones se concentran sobre la diagonal principal, lo que indica clasificación correcta en gran parte de los casos. Los errores se concentran principalmente entre subtipos con perfiles sintomáticos cercanos o con menor número de ejemplos. Esto sugiere que el modelo discrimina adecuadamente las categorías principales, aunque presenta mayor incertidumbre en clases parcialmente solapadas.</w:t>
       </w:r>
     </w:p>
     <w:p>
@@ -2986,7 +2948,7 @@
         <w:rPr>
           <w:lang w:val="es-ES"/>
         </w:rPr>
-        <w:t xml:space="preserve">Figura 10. Curvas ROC multiclase OvR para el modelo Random Forest.</w:t>
+        <w:t>Figura 10. Curvas ROC multiclase OvR para el modelo Random Forest.</w:t>
       </w:r>
     </w:p>
     <w:p>
@@ -3003,7 +2965,7 @@
           <w:sz w:val="22"/>
           <w:lang w:val="es-ES"/>
         </w:rPr>
-        <w:t xml:space="preserve">Las curvas ROC muestran alta capacidad de separación entre clases bajo el esquema one-vs-rest. Los valores AUC cercanos a 1 indican que el modelo distingue correctamente la mayoría de categorías en términos probabilísticos. Sin embargo, un AUC elevado no implica ausencia de errores clínicamente relevantes, especialmente en clases minoritarias.</w:t>
+        <w:t>Las curvas ROC muestran alta capacidad de separación entre clases bajo el esquema one-vs-rest. Los valores AUC cercanos a 1 indican que el modelo distingue correctamente la mayoría de categorías en términos probabilísticos. Sin embargo, un AUC elevado no implica ausencia de errores clínicamente relevantes, especialmente en clases minoritarias.</w:t>
       </w:r>
     </w:p>
     <w:p>
@@ -3674,7 +3636,7 @@
           <w:rFonts w:asciiTheme="minorHAnsi" w:hAnsiTheme="minorHAnsi"/>
           <w:lang w:val="es-ES"/>
         </w:rPr>
-        <w:t xml:space="preserve">El análisis de proxy individual no identificó una variable única con F1-macro mayor o igual a 0.70 entre los predictores incluidos. Sin embargo, el bloque BASC-3 actúa como conjunto de alto poder discriminante. Esto no invalida el modelo para apoyar o auditar decisiones con información clínica disponible, pero limita su interpretación como fuente de evidencia diagnóstica independiente.</w:t>
+        <w:t>El análisis de proxy individual no identificó una variable única con F1-macro mayor o igual a 0.70 entre los predictores incluidos. Sin embargo, el bloque BASC-3 actúa como conjunto de alto poder discriminante. Esto no invalida el modelo para apoyar o auditar decisiones con información clínica disponible, pero limita su interpretación como fuente de evidencia diagnóstica independiente.</w:t>
       </w:r>
     </w:p>
     <w:p>
@@ -3704,21 +3666,12 @@
           <w:lang w:val="es-ES"/>
         </w:rPr>
       </w:pPr>
-      <w:ins w:id="90007" w:author="Claude" w:date="2026-10-28T19:30:00Z">
-        <w:r>
-          <w:rPr>
-            <w:rFonts w:asciiTheme="minorHAnsi" w:hAnsiTheme="minorHAnsi"/>
-            <w:lang w:val="es-ES"/>
-          </w:rPr>
-          <w:t xml:space="preserve">Este análisis y el estudio de ablación (sección 7) se ejecutaron con un Random Forest con min_samples_leaf = 1 (valor por defecto), cuyo F1-macro en prueba es 0.942; el modelo seleccionado (min_samples_leaf = 2, Tabla 3) comete 8 errores sobre los mismos 175 casos. </w:t>
-        </w:r>
-      </w:ins>
       <w:r>
         <w:rPr>
           <w:rFonts w:asciiTheme="minorHAnsi" w:hAnsiTheme="minorHAnsi"/>
           <w:lang w:val="es-ES"/>
         </w:rPr>
-        <w:t xml:space="preserve">En el conjunto de prueba se observaron 10 errores de clasificación sobre 175 casos, equivalentes al 5.7 %. Las clases con F1 inferior a 0.90 fueron TDAH combinado, TDAH hiperactivo/impulsivo y TDAH inatento + TND.</w:t>
+        <w:t>Este análisis y el estudio de ablación (sección 7) se ejecutaron con un Random Forest con min_samples_leaf = 1 (valor por defecto), cuyo F1-macro en prueba es 0.942; el modelo seleccionado (min_samples_leaf = 2, Tabla 3) comete 8 errores sobre los mismos 175 casos. En el conjunto de prueba se observaron 10 errores de clasificación sobre 175 casos, equivalentes al 5.7 %. Las clases con F1 inferior a 0.90 fueron TDAH combinado, TDAH hiperactivo/impulsivo y TDAH inatento + TND.</w:t>
       </w:r>
     </w:p>
     <w:p>
@@ -4383,32 +4336,7 @@
           <w:rFonts w:asciiTheme="minorHAnsi" w:hAnsiTheme="minorHAnsi"/>
           <w:lang w:val="es-ES"/>
         </w:rPr>
-        <w:t xml:space="preserve">Confianza media en errores: </w:t>
-      </w:r>
-      <w:del w:id="90032" w:author="Claude" w:date="2026-10-28T19:30:00Z">
-        <w:r>
-          <w:rPr>
-            <w:rFonts w:asciiTheme="minorHAnsi" w:hAnsiTheme="minorHAnsi"/>
-            <w:lang w:val="es-ES"/>
-          </w:rPr>
-          <w:delText xml:space="preserve">0.490</w:delText>
-        </w:r>
-      </w:del>
-      <w:ins w:id="90033" w:author="Claude" w:date="2026-10-28T19:30:00Z">
-        <w:r>
-          <w:rPr>
-            <w:rFonts w:asciiTheme="minorHAnsi" w:hAnsiTheme="minorHAnsi"/>
-            <w:lang w:val="es-ES"/>
-          </w:rPr>
-          <w:t xml:space="preserve">0.499</w:t>
-        </w:r>
-      </w:ins>
-      <w:r>
-        <w:rPr>
-          <w:rFonts w:asciiTheme="minorHAnsi" w:hAnsiTheme="minorHAnsi"/>
-          <w:lang w:val="es-ES"/>
-        </w:rPr>
-        <w:t xml:space="preserve">.</w:t>
+        <w:t>Confianza media en errores: 0.499.</w:t>
       </w:r>
     </w:p>
     <w:p>
@@ -4477,16 +4405,8 @@
         <w:rPr>
           <w:lang w:val="es-ES"/>
         </w:rPr>
-        <w:t xml:space="preserve">Figura 12. Tipos de error y distribución de confianza en aciertos y errores.</w:t>
+        <w:t>Figura 12. Tipos de error y distribución de confianza en aciertos y errores. La figura proviene del notebook integrador (informe_tecnico_13clases), cuya ejecución registra 9 errores; por eso sus conteos difieren levemente del texto.</w:t>
       </w:r>
-      <w:ins w:id="90034" w:author="Claude" w:date="2026-10-28T19:30:00Z">
-        <w:r>
-          <w:rPr>
-            <w:lang w:val="es-ES"/>
-          </w:rPr>
-          <w:t xml:space="preserve"> La figura proviene del notebook integrador (informe_tecnico_13clases), cuya ejecución registra 9 errores; por eso sus conteos difieren levemente del texto.</w:t>
-        </w:r>
-      </w:ins>
     </w:p>
     <w:p>
       <w:pPr>
@@ -4526,7 +4446,7 @@
           <w:rFonts w:asciiTheme="minorHAnsi" w:hAnsiTheme="minorHAnsi"/>
           <w:lang w:val="es-ES"/>
         </w:rPr>
-        <w:t xml:space="preserve">Los pares de confusión más frecuentes se concentran en la frontera entre los subtipos TDAH Combinado e Hiperactivo/Impulsivo. El único error intra-subtipo correspondió a un caso de TDAH Inatento+TND clasificado como TDAH Inatento, donde el componente conductual TND no fue suficientemente pronunciado para que el modelo lo detectara. El 90% de los errores son entre subtipos principales; la detección de comorbilidades (TND, TEAZ, TEA) es la parte más robusta.</w:t>
+        <w:t>Los pares de confusión más frecuentes se concentran en la frontera entre los subtipos TDAH Combinado e Hiperactivo/Impulsivo. El único error intra-subtipo correspondió a un caso de TDAH Inatento+TND clasificado como TDAH Inatento, donde el componente conductual TND no fue suficientemente pronunciado para que el modelo lo detectara. El 90% de los errores son entre subtipos principales; la detección de comorbilidades (TND, TEAZ, TEA) es la parte más robusta.</w:t>
       </w:r>
     </w:p>
     <w:p>
@@ -4652,7 +4572,7 @@
                 <w:sz w:val="18"/>
                 <w:lang w:val="es-ES"/>
               </w:rPr>
-              <w:t xml:space="preserve">N features</w:t>
+              <w:t>N features</w:t>
             </w:r>
           </w:p>
         </w:tc>
@@ -4813,28 +4733,15 @@
                 <w:lang w:val="es-ES"/>
               </w:rPr>
             </w:pPr>
-            <w:del w:id="90008" w:author="Claude" w:date="2026-10-28T19:30:00Z">
-              <w:r>
-                <w:rPr>
-                  <w:rFonts w:asciiTheme="minorHAnsi" w:hAnsiTheme="minorHAnsi"/>
-                  <w:color w:val="000000"/>
-                  <w:sz w:val="18"/>
-                  <w:lang w:val="es-ES"/>
-                </w:rPr>
-                <w:delText xml:space="preserve">0.959</w:delText>
-              </w:r>
-            </w:del>
-            <w:ins w:id="90009" w:author="Claude" w:date="2026-10-28T19:30:00Z">
-              <w:r>
-                <w:rPr>
-                  <w:rFonts w:asciiTheme="minorHAnsi" w:hAnsiTheme="minorHAnsi"/>
-                  <w:color w:val="000000"/>
-                  <w:sz w:val="18"/>
-                  <w:lang w:val="es-ES"/>
-                </w:rPr>
-                <w:t xml:space="preserve">0.954</w:t>
-              </w:r>
-            </w:ins>
+            <w:r>
+              <w:rPr>
+                <w:rFonts w:asciiTheme="minorHAnsi" w:hAnsiTheme="minorHAnsi"/>
+                <w:color w:val="000000"/>
+                <w:sz w:val="18"/>
+                <w:lang w:val="es-ES"/>
+              </w:rPr>
+              <w:t>0.954</w:t>
+            </w:r>
           </w:p>
         </w:tc>
         <w:tc>
@@ -4852,28 +4759,15 @@
                 <w:lang w:val="es-ES"/>
               </w:rPr>
             </w:pPr>
-            <w:del w:id="90010" w:author="Claude" w:date="2026-10-28T19:30:00Z">
-              <w:r>
-                <w:rPr>
-                  <w:rFonts w:asciiTheme="minorHAnsi" w:hAnsiTheme="minorHAnsi"/>
-                  <w:color w:val="000000"/>
-                  <w:sz w:val="18"/>
-                  <w:lang w:val="es-ES"/>
-                </w:rPr>
-                <w:delText xml:space="preserve">0.014</w:delText>
-              </w:r>
-            </w:del>
-            <w:ins w:id="90011" w:author="Claude" w:date="2026-10-28T19:30:00Z">
-              <w:r>
-                <w:rPr>
-                  <w:rFonts w:asciiTheme="minorHAnsi" w:hAnsiTheme="minorHAnsi"/>
-                  <w:color w:val="000000"/>
-                  <w:sz w:val="18"/>
-                  <w:lang w:val="es-ES"/>
-                </w:rPr>
-                <w:t xml:space="preserve">0.016</w:t>
-              </w:r>
-            </w:ins>
+            <w:r>
+              <w:rPr>
+                <w:rFonts w:asciiTheme="minorHAnsi" w:hAnsiTheme="minorHAnsi"/>
+                <w:color w:val="000000"/>
+                <w:sz w:val="18"/>
+                <w:lang w:val="es-ES"/>
+              </w:rPr>
+              <w:t>0.016</w:t>
+            </w:r>
           </w:p>
         </w:tc>
         <w:tc>
@@ -4974,28 +4868,15 @@
                 <w:lang w:val="es-ES"/>
               </w:rPr>
             </w:pPr>
-            <w:del w:id="90012" w:author="Claude" w:date="2026-10-28T19:30:00Z">
-              <w:r>
-                <w:rPr>
-                  <w:rFonts w:asciiTheme="minorHAnsi" w:hAnsiTheme="minorHAnsi"/>
-                  <w:color w:val="000000"/>
-                  <w:sz w:val="18"/>
-                  <w:lang w:val="es-ES"/>
-                </w:rPr>
-                <w:delText xml:space="preserve">0.831</w:delText>
-              </w:r>
-            </w:del>
-            <w:ins w:id="90013" w:author="Claude" w:date="2026-10-28T19:30:00Z">
-              <w:r>
-                <w:rPr>
-                  <w:rFonts w:asciiTheme="minorHAnsi" w:hAnsiTheme="minorHAnsi"/>
-                  <w:color w:val="000000"/>
-                  <w:sz w:val="18"/>
-                  <w:lang w:val="es-ES"/>
-                </w:rPr>
-                <w:t xml:space="preserve">0.833</w:t>
-              </w:r>
-            </w:ins>
+            <w:r>
+              <w:rPr>
+                <w:rFonts w:asciiTheme="minorHAnsi" w:hAnsiTheme="minorHAnsi"/>
+                <w:color w:val="000000"/>
+                <w:sz w:val="18"/>
+                <w:lang w:val="es-ES"/>
+              </w:rPr>
+              <w:t>0.833</w:t>
+            </w:r>
           </w:p>
         </w:tc>
         <w:tc>
@@ -5013,28 +4894,15 @@
                 <w:lang w:val="es-ES"/>
               </w:rPr>
             </w:pPr>
-            <w:del w:id="90014" w:author="Claude" w:date="2026-10-28T19:30:00Z">
-              <w:r>
-                <w:rPr>
-                  <w:rFonts w:asciiTheme="minorHAnsi" w:hAnsiTheme="minorHAnsi"/>
-                  <w:color w:val="000000"/>
-                  <w:sz w:val="18"/>
-                  <w:lang w:val="es-ES"/>
-                </w:rPr>
-                <w:delText xml:space="preserve">0.047</w:delText>
-              </w:r>
-            </w:del>
-            <w:ins w:id="90015" w:author="Claude" w:date="2026-10-28T19:30:00Z">
-              <w:r>
-                <w:rPr>
-                  <w:rFonts w:asciiTheme="minorHAnsi" w:hAnsiTheme="minorHAnsi"/>
-                  <w:color w:val="000000"/>
-                  <w:sz w:val="18"/>
-                  <w:lang w:val="es-ES"/>
-                </w:rPr>
-                <w:t xml:space="preserve">0.045</w:t>
-              </w:r>
-            </w:ins>
+            <w:r>
+              <w:rPr>
+                <w:rFonts w:asciiTheme="minorHAnsi" w:hAnsiTheme="minorHAnsi"/>
+                <w:color w:val="000000"/>
+                <w:sz w:val="18"/>
+                <w:lang w:val="es-ES"/>
+              </w:rPr>
+              <w:t>0.045</w:t>
+            </w:r>
           </w:p>
         </w:tc>
         <w:tc>
@@ -5136,28 +5004,15 @@
                 <w:lang w:val="es-ES"/>
               </w:rPr>
             </w:pPr>
-            <w:del w:id="90016" w:author="Claude" w:date="2026-10-28T19:30:00Z">
-              <w:r>
-                <w:rPr>
-                  <w:rFonts w:asciiTheme="minorHAnsi" w:hAnsiTheme="minorHAnsi"/>
-                  <w:color w:val="000000"/>
-                  <w:sz w:val="18"/>
-                  <w:lang w:val="es-ES"/>
-                </w:rPr>
-                <w:delText xml:space="preserve">0.830</w:delText>
-              </w:r>
-            </w:del>
-            <w:ins w:id="90017" w:author="Claude" w:date="2026-10-28T19:30:00Z">
-              <w:r>
-                <w:rPr>
-                  <w:rFonts w:asciiTheme="minorHAnsi" w:hAnsiTheme="minorHAnsi"/>
-                  <w:color w:val="000000"/>
-                  <w:sz w:val="18"/>
-                  <w:lang w:val="es-ES"/>
-                </w:rPr>
-                <w:t xml:space="preserve">0.829</w:t>
-              </w:r>
-            </w:ins>
+            <w:r>
+              <w:rPr>
+                <w:rFonts w:asciiTheme="minorHAnsi" w:hAnsiTheme="minorHAnsi"/>
+                <w:color w:val="000000"/>
+                <w:sz w:val="18"/>
+                <w:lang w:val="es-ES"/>
+              </w:rPr>
+              <w:t>0.829</w:t>
+            </w:r>
           </w:p>
         </w:tc>
         <w:tc>
@@ -5284,28 +5139,15 @@
                 <w:lang w:val="es-ES"/>
               </w:rPr>
             </w:pPr>
-            <w:del w:id="90018" w:author="Claude" w:date="2026-10-28T19:30:00Z">
-              <w:r>
-                <w:rPr>
-                  <w:rFonts w:asciiTheme="minorHAnsi" w:hAnsiTheme="minorHAnsi"/>
-                  <w:color w:val="000000"/>
-                  <w:sz w:val="18"/>
-                  <w:lang w:val="es-ES"/>
-                </w:rPr>
-                <w:delText xml:space="preserve">0.245</w:delText>
-              </w:r>
-            </w:del>
-            <w:ins w:id="90019" w:author="Claude" w:date="2026-10-28T19:30:00Z">
-              <w:r>
-                <w:rPr>
-                  <w:rFonts w:asciiTheme="minorHAnsi" w:hAnsiTheme="minorHAnsi"/>
-                  <w:color w:val="000000"/>
-                  <w:sz w:val="18"/>
-                  <w:lang w:val="es-ES"/>
-                </w:rPr>
-                <w:t xml:space="preserve">0.248</w:t>
-              </w:r>
-            </w:ins>
+            <w:r>
+              <w:rPr>
+                <w:rFonts w:asciiTheme="minorHAnsi" w:hAnsiTheme="minorHAnsi"/>
+                <w:color w:val="000000"/>
+                <w:sz w:val="18"/>
+                <w:lang w:val="es-ES"/>
+              </w:rPr>
+              <w:t>0.248</w:t>
+            </w:r>
           </w:p>
         </w:tc>
         <w:tc>
@@ -5323,28 +5165,15 @@
                 <w:lang w:val="es-ES"/>
               </w:rPr>
             </w:pPr>
-            <w:del w:id="90020" w:author="Claude" w:date="2026-10-28T19:30:00Z">
-              <w:r>
-                <w:rPr>
-                  <w:rFonts w:asciiTheme="minorHAnsi" w:hAnsiTheme="minorHAnsi"/>
-                  <w:color w:val="000000"/>
-                  <w:sz w:val="18"/>
-                  <w:lang w:val="es-ES"/>
-                </w:rPr>
-                <w:delText xml:space="preserve">0.035</w:delText>
-              </w:r>
-            </w:del>
-            <w:ins w:id="90021" w:author="Claude" w:date="2026-10-28T19:30:00Z">
-              <w:r>
-                <w:rPr>
-                  <w:rFonts w:asciiTheme="minorHAnsi" w:hAnsiTheme="minorHAnsi"/>
-                  <w:color w:val="000000"/>
-                  <w:sz w:val="18"/>
-                  <w:lang w:val="es-ES"/>
-                </w:rPr>
-                <w:t xml:space="preserve">0.039</w:t>
-              </w:r>
-            </w:ins>
+            <w:r>
+              <w:rPr>
+                <w:rFonts w:asciiTheme="minorHAnsi" w:hAnsiTheme="minorHAnsi"/>
+                <w:color w:val="000000"/>
+                <w:sz w:val="18"/>
+                <w:lang w:val="es-ES"/>
+              </w:rPr>
+              <w:t>0.039</w:t>
+            </w:r>
           </w:p>
         </w:tc>
         <w:tc>
@@ -5362,28 +5191,15 @@
                 <w:lang w:val="es-ES"/>
               </w:rPr>
             </w:pPr>
-            <w:del w:id="90022" w:author="Claude" w:date="2026-10-28T19:30:00Z">
-              <w:r>
-                <w:rPr>
-                  <w:rFonts w:asciiTheme="minorHAnsi" w:hAnsiTheme="minorHAnsi"/>
-                  <w:color w:val="000000"/>
-                  <w:sz w:val="18"/>
-                  <w:lang w:val="es-ES"/>
-                </w:rPr>
-                <w:delText xml:space="preserve">0.268</w:delText>
-              </w:r>
-            </w:del>
-            <w:ins w:id="90023" w:author="Claude" w:date="2026-10-28T19:30:00Z">
-              <w:r>
-                <w:rPr>
-                  <w:rFonts w:asciiTheme="minorHAnsi" w:hAnsiTheme="minorHAnsi"/>
-                  <w:color w:val="000000"/>
-                  <w:sz w:val="18"/>
-                  <w:lang w:val="es-ES"/>
-                </w:rPr>
-                <w:t xml:space="preserve">0.258</w:t>
-              </w:r>
-            </w:ins>
+            <w:r>
+              <w:rPr>
+                <w:rFonts w:asciiTheme="minorHAnsi" w:hAnsiTheme="minorHAnsi"/>
+                <w:color w:val="000000"/>
+                <w:sz w:val="18"/>
+                <w:lang w:val="es-ES"/>
+              </w:rPr>
+              <w:t>0.258</w:t>
+            </w:r>
           </w:p>
         </w:tc>
       </w:tr>
@@ -5459,28 +5275,15 @@
                 <w:lang w:val="es-ES"/>
               </w:rPr>
             </w:pPr>
-            <w:del w:id="90024" w:author="Claude" w:date="2026-10-28T19:30:00Z">
-              <w:r>
-                <w:rPr>
-                  <w:rFonts w:asciiTheme="minorHAnsi" w:hAnsiTheme="minorHAnsi"/>
-                  <w:color w:val="000000"/>
-                  <w:sz w:val="18"/>
-                  <w:lang w:val="es-ES"/>
-                </w:rPr>
-                <w:delText xml:space="preserve">0.876</w:delText>
-              </w:r>
-            </w:del>
-            <w:ins w:id="90025" w:author="Claude" w:date="2026-10-28T19:30:00Z">
-              <w:r>
-                <w:rPr>
-                  <w:rFonts w:asciiTheme="minorHAnsi" w:hAnsiTheme="minorHAnsi"/>
-                  <w:color w:val="000000"/>
-                  <w:sz w:val="18"/>
-                  <w:lang w:val="es-ES"/>
-                </w:rPr>
-                <w:t xml:space="preserve">0.874</w:t>
-              </w:r>
-            </w:ins>
+            <w:r>
+              <w:rPr>
+                <w:rFonts w:asciiTheme="minorHAnsi" w:hAnsiTheme="minorHAnsi"/>
+                <w:color w:val="000000"/>
+                <w:sz w:val="18"/>
+                <w:lang w:val="es-ES"/>
+              </w:rPr>
+              <w:t>0.874</w:t>
+            </w:r>
           </w:p>
         </w:tc>
         <w:tc>
@@ -5498,28 +5301,15 @@
                 <w:lang w:val="es-ES"/>
               </w:rPr>
             </w:pPr>
-            <w:del w:id="90026" w:author="Claude" w:date="2026-10-28T19:30:00Z">
-              <w:r>
-                <w:rPr>
-                  <w:rFonts w:asciiTheme="minorHAnsi" w:hAnsiTheme="minorHAnsi"/>
-                  <w:color w:val="000000"/>
-                  <w:sz w:val="18"/>
-                  <w:lang w:val="es-ES"/>
-                </w:rPr>
-                <w:delText xml:space="preserve">0.025</w:delText>
-              </w:r>
-            </w:del>
-            <w:ins w:id="90027" w:author="Claude" w:date="2026-10-28T19:30:00Z">
-              <w:r>
-                <w:rPr>
-                  <w:rFonts w:asciiTheme="minorHAnsi" w:hAnsiTheme="minorHAnsi"/>
-                  <w:color w:val="000000"/>
-                  <w:sz w:val="18"/>
-                  <w:lang w:val="es-ES"/>
-                </w:rPr>
-                <w:t xml:space="preserve">0.030</w:t>
-              </w:r>
-            </w:ins>
+            <w:r>
+              <w:rPr>
+                <w:rFonts w:asciiTheme="minorHAnsi" w:hAnsiTheme="minorHAnsi"/>
+                <w:color w:val="000000"/>
+                <w:sz w:val="18"/>
+                <w:lang w:val="es-ES"/>
+              </w:rPr>
+              <w:t>0.030</w:t>
+            </w:r>
           </w:p>
         </w:tc>
         <w:tc>
@@ -5570,6 +5360,7 @@
       <w:r>
         <w:rPr>
           <w:rFonts w:asciiTheme="minorHAnsi" w:hAnsiTheme="minorHAnsi"/>
+          <w:noProof/>
           <w:lang w:val="es-ES"/>
         </w:rPr>
         <w:lastRenderedPageBreak/>
@@ -5690,32 +5481,7 @@
           <w:rFonts w:asciiTheme="minorHAnsi" w:hAnsiTheme="minorHAnsi"/>
           <w:lang w:val="es-ES"/>
         </w:rPr>
-        <w:t xml:space="preserve">La eliminación completa del BASC-3 produce la caída más marcada: </w:t>
-      </w:r>
-      <w:del w:id="90028" w:author="Claude" w:date="2026-10-28T19:30:00Z">
-        <w:r>
-          <w:rPr>
-            <w:rFonts w:asciiTheme="minorHAnsi" w:hAnsiTheme="minorHAnsi"/>
-            <w:lang w:val="es-ES"/>
-          </w:rPr>
-          <w:delText xml:space="preserve">-67.4</w:delText>
-        </w:r>
-      </w:del>
-      <w:ins w:id="90029" w:author="Claude" w:date="2026-10-28T19:30:00Z">
-        <w:r>
-          <w:rPr>
-            <w:rFonts w:asciiTheme="minorHAnsi" w:hAnsiTheme="minorHAnsi"/>
-            <w:lang w:val="es-ES"/>
-          </w:rPr>
-          <w:t xml:space="preserve">-68.4</w:t>
-        </w:r>
-      </w:ins>
-      <w:r>
-        <w:rPr>
-          <w:rFonts w:asciiTheme="minorHAnsi" w:hAnsiTheme="minorHAnsi"/>
-          <w:lang w:val="es-ES"/>
-        </w:rPr>
-        <w:t xml:space="preserve"> puntos en F1-macro frente al modelo completo.</w:t>
+        <w:t>La eliminación completa del BASC-3 produce la caída más marcada: -68.4 puntos en F1-macro frente al modelo completo.</w:t>
       </w:r>
     </w:p>
     <w:p>
@@ -5839,7 +5605,7 @@
           <w:rFonts w:asciiTheme="minorHAnsi" w:hAnsiTheme="minorHAnsi"/>
           <w:lang w:val="es-ES"/>
         </w:rPr>
-        <w:t xml:space="preserve">Las escalas BASC-3, en especial problemas de atención e hiperactividad, fueron los predictores más informativos dentro del conjunto de variables conservadas tras el control de leakage.</w:t>
+        <w:t>Las escalas BASC-3, en especial problemas de atención e hiperactividad, fueron los predictores más informativos dentro del conjunto de variables conservadas tras el control de leakage.</w:t>
       </w:r>
     </w:p>
     <w:p>
@@ -5857,32 +5623,7 @@
           <w:rFonts w:asciiTheme="minorHAnsi" w:hAnsiTheme="minorHAnsi"/>
           <w:lang w:val="es-ES"/>
         </w:rPr>
-        <w:t xml:space="preserve">Random Forest presentó el mejor desempeño entre los modelos evaluados, con F1-macro de </w:t>
-      </w:r>
-      <w:del w:id="90030" w:author="Claude" w:date="2026-10-28T19:30:00Z">
-        <w:r>
-          <w:rPr>
-            <w:rFonts w:asciiTheme="minorHAnsi" w:hAnsiTheme="minorHAnsi"/>
-            <w:lang w:val="es-ES"/>
-          </w:rPr>
-          <w:delText xml:space="preserve">0.942</w:delText>
-        </w:r>
-      </w:del>
-      <w:ins w:id="90031" w:author="Claude" w:date="2026-10-28T19:30:00Z">
-        <w:r>
-          <w:rPr>
-            <w:rFonts w:asciiTheme="minorHAnsi" w:hAnsiTheme="minorHAnsi"/>
-            <w:lang w:val="es-ES"/>
-          </w:rPr>
-          <w:t xml:space="preserve">0.952</w:t>
-        </w:r>
-      </w:ins>
-      <w:r>
-        <w:rPr>
-          <w:rFonts w:asciiTheme="minorHAnsi" w:hAnsiTheme="minorHAnsi"/>
-          <w:lang w:val="es-ES"/>
-        </w:rPr>
-        <w:t xml:space="preserve"> en el conjunto de prueba.</w:t>
+        <w:t>Random Forest presentó el mejor desempeño entre los modelos evaluados, con F1-macro de 0.952 en el conjunto de prueba.</w:t>
       </w:r>
     </w:p>
     <w:p>
@@ -6365,7 +6106,7 @@
                 <w:sz w:val="18"/>
                 <w:lang w:val="es-ES"/>
               </w:rPr>
-              <w:t xml:space="preserve">Variables excluidas por leakage</w:t>
+              <w:t>Variables excluidas por leakage</w:t>
             </w:r>
           </w:p>
         </w:tc>
@@ -6417,7 +6158,7 @@
                 <w:sz w:val="18"/>
                 <w:lang w:val="es-ES"/>
               </w:rPr>
-              <w:t xml:space="preserve">Mantener dos escenarios: modelo sin leakage para evaluación metodológica y modelo clínico operacional claramente rotulado.</w:t>
+              <w:t>Mantener dos escenarios: modelo sin leakage para evaluación metodológica y modelo clínico operacional claramente rotulado.</w:t>
             </w:r>
           </w:p>
         </w:tc>
@@ -6443,7 +6184,7 @@
 </file>
 
 <file path=word/endnotes.xml><?xml version="1.0" encoding="utf-8"?>
-<w:endnotes xmlns:wpc="http://schemas.microsoft.com/office/word/2010/wordprocessingCanvas" xmlns:cx="http://schemas.microsoft.com/office/drawing/2014/chartex" xmlns:cx1="http://schemas.microsoft.com/office/drawing/2015/9/8/chartex" xmlns:cx2="http://schemas.microsoft.com/office/drawing/2015/10/21/chartex" xmlns:cx3="http://schemas.microsoft.com/office/drawing/2016/5/9/chartex" xmlns:cx4="http://schemas.microsoft.com/office/drawing/2016/5/10/chartex" xmlns:cx5="http://schemas.microsoft.com/office/drawing/2016/5/11/chartex" xmlns:cx6="http://schemas.microsoft.com/office/drawing/2016/5/12/chartex" xmlns:cx7="http://schemas.microsoft.com/office/drawing/2016/5/13/chartex" xmlns:cx8="http://schemas.microsoft.com/office/drawing/2016/5/14/chartex" xmlns:mc="http://schemas.openxmlformats.org/markup-compatibility/2006" xmlns:aink="http://schemas.microsoft.com/office/drawing/2016/ink" xmlns:am3d="http://schemas.microsoft.com/office/drawing/2017/model3d" xmlns:o="urn:schemas-microsoft-com:office:office" xmlns:oel="http://schemas.microsoft.com/office/2019/extlst" xmlns:r="http://schemas.openxmlformats.org/officeDocument/2006/relationships" xmlns:m="http://schemas.openxmlformats.org/officeDocument/2006/math" xmlns:v="urn:schemas-microsoft-com:vml" xmlns:wp14="http://schemas.microsoft.com/office/word/2010/wordprocessingDrawing" xmlns:wp="http://schemas.openxmlformats.org/drawingml/2006/wordprocessingDrawing" xmlns:w10="urn:schemas-microsoft-com:office:word" xmlns:w="http://schemas.openxmlformats.org/wordprocessingml/2006/main" xmlns:w14="http://schemas.microsoft.com/office/word/2010/wordml" xmlns:w15="http://schemas.microsoft.com/office/word/2012/wordml" xmlns:w16cex="http://schemas.microsoft.com/office/word/2018/wordml/cex" xmlns:w16cid="http://schemas.microsoft.com/office/word/2016/wordml/cid" xmlns:w16="http://schemas.microsoft.com/office/word/2018/wordml" xmlns:w16du="http://schemas.microsoft.com/office/word/2023/wordml/word16du" xmlns:w16sdtdh="http://schemas.microsoft.com/office/word/2020/wordml/sdtdatahash" xmlns:w16sdtfl="http://schemas.microsoft.com/office/word/2024/wordml/sdtformatlock" xmlns:w16se="http://schemas.microsoft.com/office/word/2015/wordml/symex" xmlns:wpg="http://schemas.microsoft.com/office/word/2010/wordprocessingGroup" xmlns:wpi="http://schemas.microsoft.com/office/word/2010/wordprocessingInk" xmlns:wne="http://schemas.microsoft.com/office/word/2006/wordml" xmlns:wps="http://schemas.microsoft.com/office/word/2010/wordprocessingShape" mc:Ignorable="w14 w15 w16se w16cid w16 w16cex w16sdtdh w16sdtfl w16du wp14">
+<w:endnotes xmlns:wpc="http://schemas.microsoft.com/office/word/2010/wordprocessingCanvas" xmlns:cx="http://schemas.microsoft.com/office/drawing/2014/chartex" xmlns:cx1="http://schemas.microsoft.com/office/drawing/2015/9/8/chartex" xmlns:cx2="http://schemas.microsoft.com/office/drawing/2015/10/21/chartex" xmlns:cx3="http://schemas.microsoft.com/office/drawing/2016/5/9/chartex" xmlns:cx4="http://schemas.microsoft.com/office/drawing/2016/5/10/chartex" xmlns:cx5="http://schemas.microsoft.com/office/drawing/2016/5/11/chartex" xmlns:cx6="http://schemas.microsoft.com/office/drawing/2016/5/12/chartex" xmlns:cx7="http://schemas.microsoft.com/office/drawing/2016/5/13/chartex" xmlns:cx8="http://schemas.microsoft.com/office/drawing/2016/5/14/chartex" xmlns:mc="http://schemas.openxmlformats.org/markup-compatibility/2006" xmlns:m="http://schemas.openxmlformats.org/officeDocument/2006/math" xmlns:aink="http://schemas.microsoft.com/office/drawing/2016/ink" xmlns:am3d="http://schemas.microsoft.com/office/drawing/2017/model3d" xmlns:oel="http://schemas.microsoft.com/office/2019/extlst" xmlns:r="http://schemas.openxmlformats.org/officeDocument/2006/relationships" xmlns:wp14="http://schemas.microsoft.com/office/word/2010/wordprocessingDrawing" xmlns:wp="http://schemas.openxmlformats.org/drawingml/2006/wordprocessingDrawing" xmlns:wpg="http://schemas.microsoft.com/office/word/2010/wordprocessingGroup" xmlns:wpi="http://schemas.microsoft.com/office/word/2010/wordprocessingInk" xmlns:wps="http://schemas.microsoft.com/office/word/2010/wordprocessingShape" xmlns:o="urn:schemas-microsoft-com:office:office" xmlns:v="urn:schemas-microsoft-com:vml" xmlns:w10="urn:schemas-microsoft-com:office:word" xmlns:w="http://schemas.openxmlformats.org/wordprocessingml/2006/main" xmlns:w14="http://schemas.microsoft.com/office/word/2010/wordml" xmlns:w15="http://schemas.microsoft.com/office/word/2012/wordml" xmlns:w16cex="http://schemas.microsoft.com/office/word/2018/wordml/cex" xmlns:w16cid="http://schemas.microsoft.com/office/word/2016/wordml/cid" xmlns:w16="http://schemas.microsoft.com/office/word/2018/wordml" xmlns:w16sdtdh="http://schemas.microsoft.com/office/word/2020/wordml/sdtdatahash" xmlns:w16sdtfl="http://schemas.microsoft.com/office/word/2024/wordml/sdtformatlock" xmlns:w16se="http://schemas.microsoft.com/office/word/2015/wordml/symex" xmlns:w16du="http://schemas.microsoft.com/office/word/2023/wordml/word16du" xmlns:wne="http://schemas.microsoft.com/office/word/2006/wordml" mc:Ignorable="w14 w15 w16se w16cid w16 w16cex w16sdtdh w16sdtfl w16du wp14">
   <w:endnote w:type="separator" w:id="-1">
     <w:p>
       <w:pPr>
@@ -6468,7 +6209,7 @@
 </file>
 
 <file path=word/footnotes.xml><?xml version="1.0" encoding="utf-8"?>
-<w:footnotes xmlns:wpc="http://schemas.microsoft.com/office/word/2010/wordprocessingCanvas" xmlns:cx="http://schemas.microsoft.com/office/drawing/2014/chartex" xmlns:cx1="http://schemas.microsoft.com/office/drawing/2015/9/8/chartex" xmlns:cx2="http://schemas.microsoft.com/office/drawing/2015/10/21/chartex" xmlns:cx3="http://schemas.microsoft.com/office/drawing/2016/5/9/chartex" xmlns:cx4="http://schemas.microsoft.com/office/drawing/2016/5/10/chartex" xmlns:cx5="http://schemas.microsoft.com/office/drawing/2016/5/11/chartex" xmlns:cx6="http://schemas.microsoft.com/office/drawing/2016/5/12/chartex" xmlns:cx7="http://schemas.microsoft.com/office/drawing/2016/5/13/chartex" xmlns:cx8="http://schemas.microsoft.com/office/drawing/2016/5/14/chartex" xmlns:mc="http://schemas.openxmlformats.org/markup-compatibility/2006" xmlns:aink="http://schemas.microsoft.com/office/drawing/2016/ink" xmlns:am3d="http://schemas.microsoft.com/office/drawing/2017/model3d" xmlns:o="urn:schemas-microsoft-com:office:office" xmlns:oel="http://schemas.microsoft.com/office/2019/extlst" xmlns:r="http://schemas.openxmlformats.org/officeDocument/2006/relationships" xmlns:m="http://schemas.openxmlformats.org/officeDocument/2006/math" xmlns:v="urn:schemas-microsoft-com:vml" xmlns:wp14="http://schemas.microsoft.com/office/word/2010/wordprocessingDrawing" xmlns:wp="http://schemas.openxmlformats.org/drawingml/2006/wordprocessingDrawing" xmlns:w10="urn:schemas-microsoft-com:office:word" xmlns:w="http://schemas.openxmlformats.org/wordprocessingml/2006/main" xmlns:w14="http://schemas.microsoft.com/office/word/2010/wordml" xmlns:w15="http://schemas.microsoft.com/office/word/2012/wordml" xmlns:w16cex="http://schemas.microsoft.com/office/word/2018/wordml/cex" xmlns:w16cid="http://schemas.microsoft.com/office/word/2016/wordml/cid" xmlns:w16="http://schemas.microsoft.com/office/word/2018/wordml" xmlns:w16du="http://schemas.microsoft.com/office/word/2023/wordml/word16du" xmlns:w16sdtdh="http://schemas.microsoft.com/office/word/2020/wordml/sdtdatahash" xmlns:w16sdtfl="http://schemas.microsoft.com/office/word/2024/wordml/sdtformatlock" xmlns:w16se="http://schemas.microsoft.com/office/word/2015/wordml/symex" xmlns:wpg="http://schemas.microsoft.com/office/word/2010/wordprocessingGroup" xmlns:wpi="http://schemas.microsoft.com/office/word/2010/wordprocessingInk" xmlns:wne="http://schemas.microsoft.com/office/word/2006/wordml" xmlns:wps="http://schemas.microsoft.com/office/word/2010/wordprocessingShape" mc:Ignorable="w14 w15 w16se w16cid w16 w16cex w16sdtdh w16sdtfl w16du wp14">
+<w:footnotes xmlns:wpc="http://schemas.microsoft.com/office/word/2010/wordprocessingCanvas" xmlns:cx="http://schemas.microsoft.com/office/drawing/2014/chartex" xmlns:cx1="http://schemas.microsoft.com/office/drawing/2015/9/8/chartex" xmlns:cx2="http://schemas.microsoft.com/office/drawing/2015/10/21/chartex" xmlns:cx3="http://schemas.microsoft.com/office/drawing/2016/5/9/chartex" xmlns:cx4="http://schemas.microsoft.com/office/drawing/2016/5/10/chartex" xmlns:cx5="http://schemas.microsoft.com/office/drawing/2016/5/11/chartex" xmlns:cx6="http://schemas.microsoft.com/office/drawing/2016/5/12/chartex" xmlns:cx7="http://schemas.microsoft.com/office/drawing/2016/5/13/chartex" xmlns:cx8="http://schemas.microsoft.com/office/drawing/2016/5/14/chartex" xmlns:mc="http://schemas.openxmlformats.org/markup-compatibility/2006" xmlns:m="http://schemas.openxmlformats.org/officeDocument/2006/math" xmlns:aink="http://schemas.microsoft.com/office/drawing/2016/ink" xmlns:am3d="http://schemas.microsoft.com/office/drawing/2017/model3d" xmlns:oel="http://schemas.microsoft.com/office/2019/extlst" xmlns:r="http://schemas.openxmlformats.org/officeDocument/2006/relationships" xmlns:wp14="http://schemas.microsoft.com/office/word/2010/wordprocessingDrawing" xmlns:wp="http://schemas.openxmlformats.org/drawingml/2006/wordprocessingDrawing" xmlns:wpg="http://schemas.microsoft.com/office/word/2010/wordprocessingGroup" xmlns:wpi="http://schemas.microsoft.com/office/word/2010/wordprocessingInk" xmlns:wps="http://schemas.microsoft.com/office/word/2010/wordprocessingShape" xmlns:o="urn:schemas-microsoft-com:office:office" xmlns:v="urn:schemas-microsoft-com:vml" xmlns:w10="urn:schemas-microsoft-com:office:word" xmlns:w="http://schemas.openxmlformats.org/wordprocessingml/2006/main" xmlns:w14="http://schemas.microsoft.com/office/word/2010/wordml" xmlns:w15="http://schemas.microsoft.com/office/word/2012/wordml" xmlns:w16cex="http://schemas.microsoft.com/office/word/2018/wordml/cex" xmlns:w16cid="http://schemas.microsoft.com/office/word/2016/wordml/cid" xmlns:w16="http://schemas.microsoft.com/office/word/2018/wordml" xmlns:w16sdtdh="http://schemas.microsoft.com/office/word/2020/wordml/sdtdatahash" xmlns:w16sdtfl="http://schemas.microsoft.com/office/word/2024/wordml/sdtformatlock" xmlns:w16se="http://schemas.microsoft.com/office/word/2015/wordml/symex" xmlns:w16du="http://schemas.microsoft.com/office/word/2023/wordml/word16du" xmlns:wne="http://schemas.microsoft.com/office/word/2006/wordml" mc:Ignorable="w14 w15 w16se w16cid w16 w16cex w16sdtdh w16sdtfl w16du wp14">
   <w:footnote w:type="separator" w:id="-1">
     <w:p>
       <w:pPr>
@@ -6493,7 +6234,7 @@
 </file>
 
 <file path=word/numbering.xml><?xml version="1.0" encoding="utf-8"?>
-<w:numbering xmlns:wpc="http://schemas.microsoft.com/office/word/2010/wordprocessingCanvas" xmlns:cx="http://schemas.microsoft.com/office/drawing/2014/chartex" xmlns:cx1="http://schemas.microsoft.com/office/drawing/2015/9/8/chartex" xmlns:cx2="http://schemas.microsoft.com/office/drawing/2015/10/21/chartex" xmlns:cx3="http://schemas.microsoft.com/office/drawing/2016/5/9/chartex" xmlns:cx4="http://schemas.microsoft.com/office/drawing/2016/5/10/chartex" xmlns:cx5="http://schemas.microsoft.com/office/drawing/2016/5/11/chartex" xmlns:cx6="http://schemas.microsoft.com/office/drawing/2016/5/12/chartex" xmlns:cx7="http://schemas.microsoft.com/office/drawing/2016/5/13/chartex" xmlns:cx8="http://schemas.microsoft.com/office/drawing/2016/5/14/chartex" xmlns:mc="http://schemas.openxmlformats.org/markup-compatibility/2006" xmlns:aink="http://schemas.microsoft.com/office/drawing/2016/ink" xmlns:am3d="http://schemas.microsoft.com/office/drawing/2017/model3d" xmlns:o="urn:schemas-microsoft-com:office:office" xmlns:oel="http://schemas.microsoft.com/office/2019/extlst" xmlns:r="http://schemas.openxmlformats.org/officeDocument/2006/relationships" xmlns:m="http://schemas.openxmlformats.org/officeDocument/2006/math" xmlns:v="urn:schemas-microsoft-com:vml" xmlns:wp14="http://schemas.microsoft.com/office/word/2010/wordprocessingDrawing" xmlns:wp="http://schemas.openxmlformats.org/drawingml/2006/wordprocessingDrawing" xmlns:w10="urn:schemas-microsoft-com:office:word" xmlns:w="http://schemas.openxmlformats.org/wordprocessingml/2006/main" xmlns:w14="http://schemas.microsoft.com/office/word/2010/wordml" xmlns:w15="http://schemas.microsoft.com/office/word/2012/wordml" xmlns:w16cex="http://schemas.microsoft.com/office/word/2018/wordml/cex" xmlns:w16cid="http://schemas.microsoft.com/office/word/2016/wordml/cid" xmlns:w16="http://schemas.microsoft.com/office/word/2018/wordml" xmlns:w16du="http://schemas.microsoft.com/office/word/2023/wordml/word16du" xmlns:w16sdtdh="http://schemas.microsoft.com/office/word/2020/wordml/sdtdatahash" xmlns:w16sdtfl="http://schemas.microsoft.com/office/word/2024/wordml/sdtformatlock" xmlns:w16se="http://schemas.microsoft.com/office/word/2015/wordml/symex" xmlns:wpg="http://schemas.microsoft.com/office/word/2010/wordprocessingGroup" xmlns:wpi="http://schemas.microsoft.com/office/word/2010/wordprocessingInk" xmlns:wne="http://schemas.microsoft.com/office/word/2006/wordml" xmlns:wps="http://schemas.microsoft.com/office/word/2010/wordprocessingShape" mc:Ignorable="w14 w15 w16se w16cid w16 w16cex w16sdtdh w16sdtfl w16du wp14">
+<w:numbering xmlns:wpc="http://schemas.microsoft.com/office/word/2010/wordprocessingCanvas" xmlns:cx="http://schemas.microsoft.com/office/drawing/2014/chartex" xmlns:cx1="http://schemas.microsoft.com/office/drawing/2015/9/8/chartex" xmlns:cx2="http://schemas.microsoft.com/office/drawing/2015/10/21/chartex" xmlns:cx3="http://schemas.microsoft.com/office/drawing/2016/5/9/chartex" xmlns:cx4="http://schemas.microsoft.com/office/drawing/2016/5/10/chartex" xmlns:cx5="http://schemas.microsoft.com/office/drawing/2016/5/11/chartex" xmlns:cx6="http://schemas.microsoft.com/office/drawing/2016/5/12/chartex" xmlns:cx7="http://schemas.microsoft.com/office/drawing/2016/5/13/chartex" xmlns:cx8="http://schemas.microsoft.com/office/drawing/2016/5/14/chartex" xmlns:mc="http://schemas.openxmlformats.org/markup-compatibility/2006" xmlns:m="http://schemas.openxmlformats.org/officeDocument/2006/math" xmlns:aink="http://schemas.microsoft.com/office/drawing/2016/ink" xmlns:am3d="http://schemas.microsoft.com/office/drawing/2017/model3d" xmlns:oel="http://schemas.microsoft.com/office/2019/extlst" xmlns:r="http://schemas.openxmlformats.org/officeDocument/2006/relationships" xmlns:wp14="http://schemas.microsoft.com/office/word/2010/wordprocessingDrawing" xmlns:wp="http://schemas.openxmlformats.org/drawingml/2006/wordprocessingDrawing" xmlns:wpg="http://schemas.microsoft.com/office/word/2010/wordprocessingGroup" xmlns:wpi="http://schemas.microsoft.com/office/word/2010/wordprocessingInk" xmlns:wps="http://schemas.microsoft.com/office/word/2010/wordprocessingShape" xmlns:o="urn:schemas-microsoft-com:office:office" xmlns:v="urn:schemas-microsoft-com:vml" xmlns:w10="urn:schemas-microsoft-com:office:word" xmlns:w="http://schemas.openxmlformats.org/wordprocessingml/2006/main" xmlns:w14="http://schemas.microsoft.com/office/word/2010/wordml" xmlns:w15="http://schemas.microsoft.com/office/word/2012/wordml" xmlns:w16cex="http://schemas.microsoft.com/office/word/2018/wordml/cex" xmlns:w16cid="http://schemas.microsoft.com/office/word/2016/wordml/cid" xmlns:w16="http://schemas.microsoft.com/office/word/2018/wordml" xmlns:w16sdtdh="http://schemas.microsoft.com/office/word/2020/wordml/sdtdatahash" xmlns:w16sdtfl="http://schemas.microsoft.com/office/word/2024/wordml/sdtformatlock" xmlns:w16se="http://schemas.microsoft.com/office/word/2015/wordml/symex" xmlns:w16du="http://schemas.microsoft.com/office/word/2023/wordml/word16du" xmlns:wne="http://schemas.microsoft.com/office/word/2006/wordml" mc:Ignorable="w14 w15 w16se w16cid w16 w16cex w16sdtdh w16sdtfl w16du wp14">
   <w:abstractNum w:abstractNumId="0" w15:restartNumberingAfterBreak="0">
     <w:nsid w:val="FFFFFF7C"/>
     <w:multiLevelType w:val="singleLevel"/>
@@ -6760,7 +6501,7 @@
 </file>
 
 <file path=word/styles.xml><?xml version="1.0" encoding="utf-8"?>
-<w:styles xmlns:mc="http://schemas.openxmlformats.org/markup-compatibility/2006" xmlns:r="http://schemas.openxmlformats.org/officeDocument/2006/relationships" xmlns:w="http://schemas.openxmlformats.org/wordprocessingml/2006/main" xmlns:w14="http://schemas.microsoft.com/office/word/2010/wordml" xmlns:w15="http://schemas.microsoft.com/office/word/2012/wordml" xmlns:w16cex="http://schemas.microsoft.com/office/word/2018/wordml/cex" xmlns:w16cid="http://schemas.microsoft.com/office/word/2016/wordml/cid" xmlns:w16="http://schemas.microsoft.com/office/word/2018/wordml" xmlns:w16du="http://schemas.microsoft.com/office/word/2023/wordml/word16du" xmlns:w16sdtdh="http://schemas.microsoft.com/office/word/2020/wordml/sdtdatahash" xmlns:w16sdtfl="http://schemas.microsoft.com/office/word/2024/wordml/sdtformatlock" xmlns:w16se="http://schemas.microsoft.com/office/word/2015/wordml/symex" mc:Ignorable="w14 w15 w16se w16cid w16 w16cex w16sdtdh w16sdtfl w16du">
+<w:styles xmlns:mc="http://schemas.openxmlformats.org/markup-compatibility/2006" xmlns:r="http://schemas.openxmlformats.org/officeDocument/2006/relationships" xmlns:w="http://schemas.openxmlformats.org/wordprocessingml/2006/main" xmlns:w14="http://schemas.microsoft.com/office/word/2010/wordml" xmlns:w15="http://schemas.microsoft.com/office/word/2012/wordml" xmlns:w16cex="http://schemas.microsoft.com/office/word/2018/wordml/cex" xmlns:w16cid="http://schemas.microsoft.com/office/word/2016/wordml/cid" xmlns:w16="http://schemas.microsoft.com/office/word/2018/wordml" xmlns:w16sdtdh="http://schemas.microsoft.com/office/word/2020/wordml/sdtdatahash" xmlns:w16sdtfl="http://schemas.microsoft.com/office/word/2024/wordml/sdtformatlock" xmlns:w16se="http://schemas.microsoft.com/office/word/2015/wordml/symex" xmlns:w16du="http://schemas.microsoft.com/office/word/2023/wordml/word16du" mc:Ignorable="w14 w15 w16se w16cid w16 w16cex w16sdtdh w16sdtfl w16du">
   <w:docDefaults>
     <w:rPrDefault>
       <w:rPr>

</xml_diff>